<commit_message>
Expand defense guide explanations
</commit_message>
<xml_diff>
--- a/docs/Шпаргалка для защиты DICOM-проекта.docx
+++ b/docs/Шпаргалка для защиты DICOM-проекта.docx
@@ -242,10 +242,10 @@
                 <w:bCs/>
                 <w:color w:val="2A7469"/>
               </w:rPr>
-              <w:t xml:space="preserve">Готовый рассказ. </w:t>
-            </w:r>
-            <w:r>
-              <w:t xml:space="preserve">Программа написана на Java 17 с интерфейсом Swing. Для чтения DICOM используется dcm4che. При импорте из метаданных читаются положение среза, шаг пикселя, толщина среза, коэффициенты Rescale Slope и Rescale Intercept. Срезы сортируются по координате Z, затем по Instance Number. Для каждого пикселя вычисляется HU. Обработка выполняется в порядке: медианный фильтр и box blur при включенном размытии, затем порог яркости и полосовой HU-фильтр, после чего применяется ручная маска. Для трехмерной визуализации обработанные ненулевые пиксели собираются в объем активных вокселей, удаляется внешний фон, одиночный шум и маленькие компоненты, а поверхностные воксели переводятся в физические координаты и отображаются как облако точек.</w:t>
+              <w:t xml:space="preserve">Готовый рассказ. Программа написана на Java 17 с интерфейсом Swing. DICOM (Digital Imaging and Communications in Medicine) — медицинский стандарт файлов изображений и сопутствующих данных; для его чтения используется dcm4che. Каждый загруженный файл представляет срез — двумерное поперечное изображение исследуемой области. Из метаданных, то есть служебных данных DICOM, читаются положение среза, физический шаг пикселя, толщина среза и коэффициенты преобразования. Срезы сортируются по координате Z, затем по Instance Number. Для каждого пикселя вычисляется HU — единица Хаунсфилда, численно характеризующая ослабление рентгеновского излучения тканью на КТ. Далее изображение очищается и ограничивается фильтрами и ручной маской. Обработанные пиксели объединяются в трехмерный объем, очищаются от шума, а его поверхность отображается как облако точек.</w:t>
+            </w:r>
+            <w:r>
+              <w:t/>
             </w:r>
           </w:p>
         </w:tc>
@@ -1076,7 +1076,21 @@
         <w:spacing w:after="120" w:line="280"/>
       </w:pPr>
       <w:r>
-        <w:t xml:space="preserve">DICOM — стандарт хранения и передачи медицинских изображений. В одном файле находятся не только пиксели, но и метаданные: номер среза, положение пациента, физический размер пикселя, толщина среза, параметры преобразования интенсивности и другие данные.</w:t>
+        <w:t xml:space="preserve">DICOM расшифровывается как Digital Imaging and Communications in Medicine — «цифровые изображения и обмен данными в медицине». Это стандарт, который определяет формат медицинских изображений и правила хранения сопутствующей информации. В одном DICOM-файле находятся пиксели изображения и метаданные — служебные сведения о снимке: номер и положение среза, физический размер пикселя, толщина среза, параметры преобразования интенсивности и другие данные.</w:t>
+      </w:r>
+    </w:p>
+    <w:p>
+      <w:pPr>
+        <w:spacing w:after="120" w:line="280" w:lineRule="auto"/>
+      </w:pPr>
+      <w:r>
+        <w:rPr>
+          <w:color w:val="1F2B2A"/>
+          <w:sz w:val="22"/>
+          <w:szCs w:val="22"/>
+          <w:rFonts w:ascii="Arial" w:hAnsi="Arial" w:cs="Arial"/>
+        </w:rPr>
+        <w:t xml:space="preserve">Пиксель — минимальный элемент двумерного изображения, имеющий координаты и числовое значение. Срез — отдельное двумерное изображение слоя исследуемой области. Последовательность правильно расположенных срезов позволяет восстановить пространственное представление объекта.</w:t>
       </w:r>
     </w:p>
     <w:p>
@@ -1091,6 +1105,20 @@
           <w:color w:val="1F2B2A"/>
         </w:rPr>
         <w:t xml:space="preserve">Что хранится в одном DicomSlice</w:t>
+      </w:r>
+    </w:p>
+    <w:p>
+      <w:pPr>
+        <w:spacing w:after="120" w:line="280" w:lineRule="auto"/>
+      </w:pPr>
+      <w:r>
+        <w:rPr>
+          <w:color w:val="1F2B2A"/>
+          <w:sz w:val="22"/>
+          <w:szCs w:val="22"/>
+          <w:rFonts w:ascii="Arial" w:hAnsi="Arial" w:cs="Arial"/>
+        </w:rPr>
+        <w:t xml:space="preserve">DicomSlice — класс модели, представляющий один загруженный срез внутри программы. Он объединяет исходное и обработанное изображения, массив HU, ручную маску и пространственные параметры, необходимые для правильного порядка и масштаба.</w:t>
       </w:r>
     </w:p>
     <w:tbl>
@@ -1698,7 +1726,7 @@
         <w:spacing w:after="120" w:line="280"/>
       </w:pPr>
       <w:r>
-        <w:t xml:space="preserve">RawPixel — исходное число из Pixel Data. Slope и Intercept берутся из метаданных DICOM. Для КТ типичные ориентиры: воздух около −1000 HU, вода около 0 HU, мягкие ткани около 0…120 HU, плотная кость — сотни и тысячи HU. Значения ориентировочные и зависят от исследования.</w:t>
+        <w:t xml:space="preserve">HU расшифровывается как Hounsfield Units — единицы Хаунсфилда. Это числовая шкала, применяемая в компьютерной томографии для оценки того, насколько ткань ослабляет рентгеновское излучение относительно воды. За ориентир приняты вода около 0 HU и воздух около −1000 HU; мягкие ткани обычно находятся около нуля и выше, а кость имеет большие положительные значения. В программе HU вычисляется из исходного RawPixel по коэффициентам Rescale Slope и Rescale Intercept, записанным в DICOM.</w:t>
       </w:r>
     </w:p>
     <w:p>
@@ -1720,7 +1748,7 @@
         <w:spacing w:after="120" w:line="280"/>
       </w:pPr>
       <w:r>
-        <w:t xml:space="preserve">HU — физически осмысленное значение плотности, сохраненное отдельно для каждого пикселя. Яркость 0…255 — удобное экранное представление. Один и тот же HU может отображаться по-разному при другом окне визуализации. Поэтому диапазон тканей выбирается по HU, а порог яркости является дополнительным визуальным порогом.</w:t>
+        <w:t xml:space="preserve">HU используются потому, что позволяют приблизительно различать ткани по их рентгеновской плотности независимо от выбранной экранной яркости. Яркость 0…255 — лишь способ показать снимок на мониторе и зависит от настроек окна. Один и тот же HU может выглядеть темнее или светлее, но его исходное значение не меняется. Поэтому тип ткани выбирается диапазоном HU, а порог яркости используется только как дополнительное условие.</w:t>
       </w:r>
     </w:p>
     <w:p>
@@ -1760,6 +1788,20 @@
       </w:pPr>
       <w:r>
         <w:t xml:space="preserve">Window Center и Window Width берутся из DICOM. Если их нет, используются значения 300 и 1600. Это преобразование нужно для изображения в интерфейсе; исходный HU-массив при этом сохраняется отдельно.</w:t>
+      </w:r>
+    </w:p>
+    <w:p>
+      <w:pPr>
+        <w:spacing w:after="120" w:line="280" w:lineRule="auto"/>
+      </w:pPr>
+      <w:r>
+        <w:rPr>
+          <w:color w:val="1F2B2A"/>
+          <w:sz w:val="22"/>
+          <w:szCs w:val="22"/>
+          <w:rFonts w:ascii="Arial" w:hAnsi="Arial" w:cs="Arial"/>
+        </w:rPr>
+        <w:t xml:space="preserve">Оконное преобразование — способ отобразить ограниченный диапазон HU оттенками серого. Window Center задает середину интересующего диапазона, а Window Width — его ширину. Значения ниже окна становятся черными, выше окна — белыми, остальные распределяются между ними.</w:t>
       </w:r>
     </w:p>
     <w:p>
@@ -2982,6 +3024,20 @@
         <w:t xml:space="preserve">Фильтрация: точный порядок</w:t>
       </w:r>
     </w:p>
+    <w:p>
+      <w:pPr>
+        <w:spacing w:after="120" w:line="280" w:lineRule="auto"/>
+      </w:pPr>
+      <w:r>
+        <w:rPr>
+          <w:color w:val="1F2B2A"/>
+          <w:sz w:val="22"/>
+          <w:szCs w:val="22"/>
+          <w:rFonts w:ascii="Arial" w:hAnsi="Arial" w:cs="Arial"/>
+        </w:rPr>
+        <w:t xml:space="preserve">Фильтрация изображения — обработка значений пикселей по заданному правилу для подавления шума или выделения нужных областей. В проекте фильтры не изменяют исходный DICOM: они создают отдельное обработанное изображение, которое можно пересчитать с другими настройками.</w:t>
+      </w:r>
+    </w:p>
     <w:tbl>
       <w:tblPr>
         <w:tblW w:type="pct" w:w="100%"/>
@@ -3052,7 +3108,52 @@
         <w:spacing w:after="120" w:line="280"/>
       </w:pPr>
       <w:r>
-        <w:t xml:space="preserve">Для каждого пикселя берутся значения окна 3×3, девять значений сортируются, результатом становится центральное — пятое. Медиана хорошо удаляет одиночные яркие или темные выбросы, сохраняя границы лучше простого усреднения. На краях координаты прижимаются к ближайшему допустимому пикселю.</w:t>
+        <w:t xml:space="preserve">Медианный фильтр — нелинейный фильтр подавления импульсного, то есть одиночного точечного, шума. Для каждого пикселя берутся значения соседнего окна 3×3, девять значений сортируются, и результатом становится центральное — пятое. Такой фильтр удаляет отдельные выбросы и обычно сохраняет границы лучше простого усреднения. На краях координаты прижимаются к ближайшему допустимому пикселю.</w:t>
+      </w:r>
+    </w:p>
+    <w:p>
+      <w:pPr>
+        <w:spacing w:before="80" w:after="120" w:line="280" w:lineRule="auto"/>
+        <w:shd w:val="clear" w:color="auto" w:fill="EAF2F0"/>
+      </w:pPr>
+      <w:r>
+        <w:rPr>
+          <w:b/>
+          <w:color w:val="2A7469"/>
+          <w:sz w:val="22"/>
+          <w:rFonts w:ascii="Arial" w:hAnsi="Arial" w:cs="Arial"/>
+        </w:rPr>
+        <w:t xml:space="preserve">Простыми словами: </w:t>
+      </w:r>
+      <w:r>
+        <w:rPr>
+          <w:color w:val="1F2B2A"/>
+          <w:sz w:val="22"/>
+          <w:rFonts w:ascii="Arial" w:hAnsi="Arial" w:cs="Arial"/>
+        </w:rPr>
+        <w:t xml:space="preserve">он смотрит на пиксель и его соседей и убирает одиночную точку, если она сильно выбивается из окружения.</w:t>
+      </w:r>
+    </w:p>
+    <w:p>
+      <w:pPr>
+        <w:spacing w:before="80" w:after="120" w:line="280" w:lineRule="auto"/>
+      </w:pPr>
+      <w:r>
+        <w:rPr>
+          <w:b/>
+          <w:color w:val="2A7469"/>
+          <w:sz w:val="22"/>
+          <w:rFonts w:ascii="Arial" w:hAnsi="Arial" w:cs="Arial"/>
+        </w:rPr>
+        <w:t xml:space="preserve">Подробнее: </w:t>
+      </w:r>
+      <w:r>
+        <w:rPr>
+          <w:color w:val="1F2B2A"/>
+          <w:sz w:val="22"/>
+          <w:rFonts w:ascii="Arial" w:hAnsi="Arial" w:cs="Arial"/>
+        </w:rPr>
+        <w:t xml:space="preserve">для каждого положения формируется девятиэлементное ядро 3×3, значения сортируются и выбирается медиана. В отличие от среднего значения медиана почти не реагирует на один очень большой или маленький выброс, поэтому метод подходит для импульсного шума. Ограничение: он не удаляет любой шум вообще и при многократном применении тоже может сглаживать мелкие детали. В проекте он выполняется один раз и только при размытии больше нуля.</w:t>
       </w:r>
     </w:p>
     <w:p>
@@ -3076,7 +3177,7 @@
         <w:spacing w:after="120" w:line="280"/>
       </w:pPr>
       <w:r>
-        <w:t xml:space="preserve">В текущем коде медианный фильтр включается, когда ползунок «Размытие» больше нуля. Размер его ядра фиксирован: 3×3.</w:t>
+        <w:t xml:space="preserve">Ядро фильтра — небольшое окно соседних пикселей, значения которых участвуют в вычислении нового значения центрального пикселя. В текущем коде ядро медианного фильтра фиксировано и равно 3×3. Медианный фильтр включается, когда ползунок «Размытие» больше нуля.</w:t>
       </w:r>
     </w:p>
     <w:p>
@@ -3098,7 +3199,52 @@
         <w:spacing w:after="120" w:line="280"/>
       </w:pPr>
       <w:r>
-        <w:t xml:space="preserve">Box blur заменяет пиксель средним значением соседей. Радиус задается ползунком 0…8, размер окна равен 2r+1. Алгоритм выполнен в два прохода — сначала горизонтально, затем вертикально — со скользящей суммой. Это значительно быстрее прямого пересчета квадратного окна для каждого пикселя.</w:t>
+        <w:t xml:space="preserve">Box blur, или прямоугольное усредняющее размытие, — линейный фильтр, заменяющий пиксель средним значением соседей внутри квадратного ядра. Он сглаживает мелкие перепады и шум, но при большом радиусе способен размыть тонкие границы. Радиус задается ползунком 0…8, размер ядра равен 2r+1. Алгоритм выполнен двумя быстрыми проходами со скользящей суммой: сначала горизонтально, затем вертикально.</w:t>
+      </w:r>
+    </w:p>
+    <w:p>
+      <w:pPr>
+        <w:spacing w:before="80" w:after="120" w:line="280" w:lineRule="auto"/>
+        <w:shd w:val="clear" w:color="auto" w:fill="EAF2F0"/>
+      </w:pPr>
+      <w:r>
+        <w:rPr>
+          <w:b/>
+          <w:color w:val="2A7469"/>
+          <w:sz w:val="22"/>
+          <w:rFonts w:ascii="Arial" w:hAnsi="Arial" w:cs="Arial"/>
+        </w:rPr>
+        <w:t xml:space="preserve">Простыми словами: </w:t>
+      </w:r>
+      <w:r>
+        <w:rPr>
+          <w:color w:val="1F2B2A"/>
+          <w:sz w:val="22"/>
+          <w:rFonts w:ascii="Arial" w:hAnsi="Arial" w:cs="Arial"/>
+        </w:rPr>
+        <w:t xml:space="preserve">он делает соседние пиксели более похожими и уменьшает мелкую зернистость изображения.</w:t>
+      </w:r>
+    </w:p>
+    <w:p>
+      <w:pPr>
+        <w:spacing w:before="80" w:after="120" w:line="280" w:lineRule="auto"/>
+      </w:pPr>
+      <w:r>
+        <w:rPr>
+          <w:b/>
+          <w:color w:val="2A7469"/>
+          <w:sz w:val="22"/>
+          <w:rFonts w:ascii="Arial" w:hAnsi="Arial" w:cs="Arial"/>
+        </w:rPr>
+        <w:t xml:space="preserve">Подробнее: </w:t>
+      </w:r>
+      <w:r>
+        <w:rPr>
+          <w:color w:val="1F2B2A"/>
+          <w:sz w:val="22"/>
+          <w:rFonts w:ascii="Arial" w:hAnsi="Arial" w:cs="Arial"/>
+        </w:rPr>
+        <w:t xml:space="preserve">каждый результат является средним значением окна размером (2r+1)×(2r+1). Двумерное усреднение реализовано как горизонтальный и вертикальный проходы, что дает тот же эффект прямоугольного ядра, но быстрее. Скользящая сумма позволяет при смещении окна вычесть уходящий пиксель и добавить новый. Большой радиус повышает сглаживание, но способен уничтожить тонкие кости и границы.</w:t>
       </w:r>
     </w:p>
     <w:p>
@@ -3137,7 +3283,52 @@
         <w:spacing w:after="120" w:line="280"/>
       </w:pPr>
       <w:r>
-        <w:t xml:space="preserve">После сглаживания пиксель остается только если его экранная яркость value не меньше threshold. Диапазон порога — 0…255. При threshold=0 этот фильтр практически ничего дополнительно не удаляет.</w:t>
+        <w:t xml:space="preserve">Пороговая фильтрация сравнивает значение пикселя с заданной границей. В проекте пиксель после сглаживания остается только если его экранная яркость value не меньше threshold; иначе он зануляется. Диапазон порога — 0…255. При threshold=0 этот фильтр практически ничего дополнительно не удаляет.</w:t>
+      </w:r>
+    </w:p>
+    <w:p>
+      <w:pPr>
+        <w:spacing w:before="80" w:after="120" w:line="280" w:lineRule="auto"/>
+        <w:shd w:val="clear" w:color="auto" w:fill="EAF2F0"/>
+      </w:pPr>
+      <w:r>
+        <w:rPr>
+          <w:b/>
+          <w:color w:val="2A7469"/>
+          <w:sz w:val="22"/>
+          <w:rFonts w:ascii="Arial" w:hAnsi="Arial" w:cs="Arial"/>
+        </w:rPr>
+        <w:t xml:space="preserve">Простыми словами: </w:t>
+      </w:r>
+      <w:r>
+        <w:rPr>
+          <w:color w:val="1F2B2A"/>
+          <w:sz w:val="22"/>
+          <w:rFonts w:ascii="Arial" w:hAnsi="Arial" w:cs="Arial"/>
+        </w:rPr>
+        <w:t xml:space="preserve">все, что темнее выбранного уровня, становится черным; более яркие пиксели могут пройти дальше.</w:t>
+      </w:r>
+    </w:p>
+    <w:p>
+      <w:pPr>
+        <w:spacing w:before="80" w:after="120" w:line="280" w:lineRule="auto"/>
+      </w:pPr>
+      <w:r>
+        <w:rPr>
+          <w:b/>
+          <w:color w:val="2A7469"/>
+          <w:sz w:val="22"/>
+          <w:rFonts w:ascii="Arial" w:hAnsi="Arial" w:cs="Arial"/>
+        </w:rPr>
+        <w:t xml:space="preserve">Подробнее: </w:t>
+      </w:r>
+      <w:r>
+        <w:rPr>
+          <w:color w:val="1F2B2A"/>
+          <w:sz w:val="22"/>
+          <w:rFonts w:ascii="Arial" w:hAnsi="Arial" w:cs="Arial"/>
+        </w:rPr>
+        <w:t xml:space="preserve">порог проверяется после медианного фильтра и box blur по экранному значению 0…255. Это однопороговая операция: value ≥ threshold. Она не определяет тип ткани и зависит от оконного отображения, поэтому служит дополнительным ограничением, а не заменой HU-фильтра.</w:t>
       </w:r>
     </w:p>
     <w:p>
@@ -3159,7 +3350,52 @@
         <w:spacing w:after="120" w:line="280"/>
       </w:pPr>
       <w:r>
-        <w:t xml:space="preserve">Пиксель остается только тогда, когда его исходное HU находится между минимальным и максимальным порогом. Все остальные пиксели зануляются. Это двойной пороговый, или полосовой, фильтр. Он выделяет не «всё выше порога», а конкретный диапазон тканей.</w:t>
+        <w:t xml:space="preserve">Полосовой, или двухпороговый, фильтр сохраняет значения внутри интервала между нижней и верхней границами. В проекте пиксель остается только тогда, когда его исходное HU находится между minHU и maxHU; все остальные пиксели зануляются. Такой выбор области по признаку называется простой пороговой сегментацией: изображение разделяется на интересующую область и фон по диапазону HU.</w:t>
+      </w:r>
+    </w:p>
+    <w:p>
+      <w:pPr>
+        <w:spacing w:before="80" w:after="120" w:line="280" w:lineRule="auto"/>
+        <w:shd w:val="clear" w:color="auto" w:fill="EAF2F0"/>
+      </w:pPr>
+      <w:r>
+        <w:rPr>
+          <w:b/>
+          <w:color w:val="2A7469"/>
+          <w:sz w:val="22"/>
+          <w:rFonts w:ascii="Arial" w:hAnsi="Arial" w:cs="Arial"/>
+        </w:rPr>
+        <w:t xml:space="preserve">Простыми словами: </w:t>
+      </w:r>
+      <w:r>
+        <w:rPr>
+          <w:color w:val="1F2B2A"/>
+          <w:sz w:val="22"/>
+          <w:rFonts w:ascii="Arial" w:hAnsi="Arial" w:cs="Arial"/>
+        </w:rPr>
+        <w:t xml:space="preserve">он оставляет только пиксели с плотностью внутри выбранного диапазона, например подходящего для костей.</w:t>
+      </w:r>
+    </w:p>
+    <w:p>
+      <w:pPr>
+        <w:spacing w:before="80" w:after="120" w:line="280" w:lineRule="auto"/>
+      </w:pPr>
+      <w:r>
+        <w:rPr>
+          <w:b/>
+          <w:color w:val="2A7469"/>
+          <w:sz w:val="22"/>
+          <w:rFonts w:ascii="Arial" w:hAnsi="Arial" w:cs="Arial"/>
+        </w:rPr>
+        <w:t xml:space="preserve">Подробнее: </w:t>
+      </w:r>
+      <w:r>
+        <w:rPr>
+          <w:color w:val="1F2B2A"/>
+          <w:sz w:val="22"/>
+          <w:rFonts w:ascii="Arial" w:hAnsi="Arial" w:cs="Arial"/>
+        </w:rPr>
+        <w:t xml:space="preserve">для каждого пикселя проверяются две границы: HU ≥ minHU и HU ≤ maxHU. Значения вне полосы зануляются. Проверка использует исходный массив huPixels, а не размытое изображение, поэтому физическая оценка ткани не меняется после сглаживания. Это простая сегментация по одному признаку; она не различает разные органы с пересекающимися HU.</w:t>
       </w:r>
     </w:p>
     <w:p>
@@ -3197,7 +3433,52 @@
         <w:spacing w:after="120" w:line="280"/>
       </w:pPr>
       <w:r>
-        <w:t xml:space="preserve">После автоматических фильтров применяется manualMask. Изначально она полностью белая. Если значение маски равно нулю, соответствующий пиксель результата также зануляется. Поэтому ручная маска может только удалить область, но не вернуть уже удаленный фильтрами пиксель.</w:t>
+        <w:t xml:space="preserve">Маска — дополнительное бинарное изображение того же размера, которое задает разрешенные и запрещенные области. В manualMask белое значение разрешает оставить результат автоматических фильтров, а черное зануляет соответствующий пиксель. Маска применяется последней, поэтому может удалить область, но не вернуть пиксель, ранее удаленный фильтрами.</w:t>
+      </w:r>
+    </w:p>
+    <w:p>
+      <w:pPr>
+        <w:spacing w:before="80" w:after="120" w:line="280" w:lineRule="auto"/>
+        <w:shd w:val="clear" w:color="auto" w:fill="EAF2F0"/>
+      </w:pPr>
+      <w:r>
+        <w:rPr>
+          <w:b/>
+          <w:color w:val="2A7469"/>
+          <w:sz w:val="22"/>
+          <w:rFonts w:ascii="Arial" w:hAnsi="Arial" w:cs="Arial"/>
+        </w:rPr>
+        <w:t xml:space="preserve">Простыми словами: </w:t>
+      </w:r>
+      <w:r>
+        <w:rPr>
+          <w:color w:val="1F2B2A"/>
+          <w:sz w:val="22"/>
+          <w:rFonts w:ascii="Arial" w:hAnsi="Arial" w:cs="Arial"/>
+        </w:rPr>
+        <w:t xml:space="preserve">это ручной трафарет: белое разрешает оставить область, черное запрещает ее.</w:t>
+      </w:r>
+    </w:p>
+    <w:p>
+      <w:pPr>
+        <w:spacing w:before="80" w:after="120" w:line="280" w:lineRule="auto"/>
+      </w:pPr>
+      <w:r>
+        <w:rPr>
+          <w:b/>
+          <w:color w:val="2A7469"/>
+          <w:sz w:val="22"/>
+          <w:rFonts w:ascii="Arial" w:hAnsi="Arial" w:cs="Arial"/>
+        </w:rPr>
+        <w:t xml:space="preserve">Подробнее: </w:t>
+      </w:r>
+      <w:r>
+        <w:rPr>
+          <w:color w:val="1F2B2A"/>
+          <w:sz w:val="22"/>
+          <w:rFonts w:ascii="Arial" w:hAnsi="Arial" w:cs="Arial"/>
+        </w:rPr>
+        <w:t xml:space="preserve">маска имеет тот же размер, что и срез, и хранится отдельно в каждом DicomSlice. При применении выполняется логическое пересечение результата фильтров с маской: пиксель остается только там, где фильтры его сохранили и маска не равна нулю. Кисть и полигон изменяют только маску, поэтому исходные пиксели и HU не теряются.</w:t>
       </w:r>
     </w:p>
     <w:p>
@@ -3834,6 +4115,51 @@
     </w:p>
     <w:p>
       <w:pPr>
+        <w:spacing w:before="80" w:after="120" w:line="280" w:lineRule="auto"/>
+        <w:shd w:val="clear" w:color="auto" w:fill="EAF2F0"/>
+      </w:pPr>
+      <w:r>
+        <w:rPr>
+          <w:b/>
+          <w:color w:val="2A7469"/>
+          <w:sz w:val="22"/>
+          <w:rFonts w:ascii="Arial" w:hAnsi="Arial" w:cs="Arial"/>
+        </w:rPr>
+        <w:t xml:space="preserve">Простыми словами: </w:t>
+      </w:r>
+      <w:r>
+        <w:rPr>
+          <w:color w:val="1F2B2A"/>
+          <w:sz w:val="22"/>
+          <w:rFonts w:ascii="Arial" w:hAnsi="Arial" w:cs="Arial"/>
+        </w:rPr>
+        <w:t xml:space="preserve">пресет — это готовый набор подходящих начальных настроек, а не автоматическое распознавание анатомии.</w:t>
+      </w:r>
+    </w:p>
+    <w:p>
+      <w:pPr>
+        <w:spacing w:before="80" w:after="120" w:line="280" w:lineRule="auto"/>
+      </w:pPr>
+      <w:r>
+        <w:rPr>
+          <w:b/>
+          <w:color w:val="2A7469"/>
+          <w:sz w:val="22"/>
+          <w:rFonts w:ascii="Arial" w:hAnsi="Arial" w:cs="Arial"/>
+        </w:rPr>
+        <w:t xml:space="preserve">Подробнее: </w:t>
+      </w:r>
+      <w:r>
+        <w:rPr>
+          <w:color w:val="1F2B2A"/>
+          <w:sz w:val="22"/>
+          <w:rFonts w:ascii="Arial" w:hAnsi="Arial" w:cs="Arial"/>
+        </w:rPr>
+        <w:t xml:space="preserve">пресет задает minHU, maxHU и рекомендуемый шаг выборки. После ручного изменения HU программа переключается на ручной диапазон, чтобы в построении не произошло скрытого пересечения двух разных наборов настроек. Диапазоны являются ориентировочными и могут требовать коррекции для конкретной серии.</w:t>
+      </w:r>
+    </w:p>
+    <w:p>
+      <w:pPr>
         <w:pStyle w:val="Heading2"/>
         <w:spacing w:after="100" w:before="220"/>
       </w:pPr>
@@ -4086,10 +4412,10 @@
                 <w:bCs/>
                 <w:color w:val="2A7469"/>
               </w:rPr>
-              <w:t xml:space="preserve">Точная формулировка. </w:t>
-            </w:r>
-            <w:r>
-              <w:t xml:space="preserve">Это облако поверхностных точек, а не полноценная полигональная 3D-модель. Между точками не создаются треугольники, как в Marching Cubes.</w:t>
+              <w:t xml:space="preserve">Облако точек — набор отдельных точек с трехмерными координатами, описывающий форму объекта в пространстве. В проекте строится облако поверхностных точек, а не полноценная полигональная 3D-модель: соседние точки не соединяются треугольными гранями.</w:t>
+            </w:r>
+            <w:r>
+              <w:t/>
             </w:r>
           </w:p>
         </w:tc>
@@ -4137,6 +4463,51 @@
     </w:p>
     <w:p>
       <w:pPr>
+        <w:spacing w:before="80" w:after="120" w:line="280" w:lineRule="auto"/>
+        <w:shd w:val="clear" w:color="auto" w:fill="EAF2F0"/>
+      </w:pPr>
+      <w:r>
+        <w:rPr>
+          <w:b/>
+          <w:color w:val="2A7469"/>
+          <w:sz w:val="22"/>
+          <w:rFonts w:ascii="Arial" w:hAnsi="Arial" w:cs="Arial"/>
+        </w:rPr>
+        <w:t xml:space="preserve">Простыми словами: </w:t>
+      </w:r>
+      <w:r>
+        <w:rPr>
+          <w:color w:val="1F2B2A"/>
+          <w:sz w:val="22"/>
+          <w:rFonts w:ascii="Arial" w:hAnsi="Arial" w:cs="Arial"/>
+        </w:rPr>
+        <w:t xml:space="preserve">шаг определяет, насколько часто программа берет пиксели и срезы: меньший шаг дает больше деталей, больший — большую скорость.</w:t>
+      </w:r>
+    </w:p>
+    <w:p>
+      <w:pPr>
+        <w:spacing w:before="80" w:after="120" w:line="280" w:lineRule="auto"/>
+      </w:pPr>
+      <w:r>
+        <w:rPr>
+          <w:b/>
+          <w:color w:val="2A7469"/>
+          <w:sz w:val="22"/>
+          <w:rFonts w:ascii="Arial" w:hAnsi="Arial" w:cs="Arial"/>
+        </w:rPr>
+        <w:t xml:space="preserve">Подробнее: </w:t>
+      </w:r>
+      <w:r>
+        <w:rPr>
+          <w:color w:val="1F2B2A"/>
+          <w:sz w:val="22"/>
+          <w:rFonts w:ascii="Arial" w:hAnsi="Arial" w:cs="Arial"/>
+        </w:rPr>
+        <w:t xml:space="preserve">при sampleStep=3 по X и Y берется примерно каждый третий пиксель. По Z используется sliceStep=max(1, sampleStep/2), потому что расстояние и число срезов отличаются от размера изображения. Выборка снижает число вокселей нелинейно: уменьшение частоты сразу по трем осям сильно сокращает объем вычислений.</w:t>
+      </w:r>
+    </w:p>
+    <w:p>
+      <w:pPr>
         <w:pStyle w:val="ListParagraph"/>
         <w:numPr>
           <w:ilvl w:val="0"/>
@@ -4145,7 +4516,52 @@
         <w:spacing w:after="90" w:line="270"/>
       </w:pPr>
       <w:r>
-        <w:t xml:space="preserve">Формируется трехмерный BitSet активных вокселей. Воксель активен, если он находится внутри маски тела и пиксель processedImage не равен нулю.</w:t>
+        <w:t xml:space="preserve">Воксель, или объемный элемент, — минимальная ячейка трехмерной решетки, аналог пикселя в объеме. После укладки срезов каждый прошедший фильтры пиксель превращается в активный воксель. Активность хранится в BitSet — компактной структуре битов, где для каждой ячейки достаточно состояния «включена» или «выключена».</w:t>
+      </w:r>
+    </w:p>
+    <w:p>
+      <w:pPr>
+        <w:spacing w:before="80" w:after="120" w:line="280" w:lineRule="auto"/>
+        <w:shd w:val="clear" w:color="auto" w:fill="EAF2F0"/>
+      </w:pPr>
+      <w:r>
+        <w:rPr>
+          <w:b/>
+          <w:color w:val="2A7469"/>
+          <w:sz w:val="22"/>
+          <w:rFonts w:ascii="Arial" w:hAnsi="Arial" w:cs="Arial"/>
+        </w:rPr>
+        <w:t xml:space="preserve">Простыми словами: </w:t>
+      </w:r>
+      <w:r>
+        <w:rPr>
+          <w:color w:val="1F2B2A"/>
+          <w:sz w:val="22"/>
+          <w:rFonts w:ascii="Arial" w:hAnsi="Arial" w:cs="Arial"/>
+        </w:rPr>
+        <w:t xml:space="preserve">после укладки срезов друг над другом каждый подходящий пиксель становится маленькой объемной ячейкой.</w:t>
+      </w:r>
+    </w:p>
+    <w:p>
+      <w:pPr>
+        <w:spacing w:before="80" w:after="120" w:line="280" w:lineRule="auto"/>
+      </w:pPr>
+      <w:r>
+        <w:rPr>
+          <w:b/>
+          <w:color w:val="2A7469"/>
+          <w:sz w:val="22"/>
+          <w:rFonts w:ascii="Arial" w:hAnsi="Arial" w:cs="Arial"/>
+        </w:rPr>
+        <w:t xml:space="preserve">Подробнее: </w:t>
+      </w:r>
+      <w:r>
+        <w:rPr>
+          <w:color w:val="1F2B2A"/>
+          <w:sz w:val="22"/>
+          <w:rFonts w:ascii="Arial" w:hAnsi="Arial" w:cs="Arial"/>
+        </w:rPr>
+        <w:t xml:space="preserve">воксель задается индексами x, y, z в дискретной трехмерной решетке. Его физический размер зависит от PixelSpacing по X/Y и расстояния между срезами по Z. В BitSet хранится только факт активности; цвет и физические координаты вычисляются позднее для поверхностных точек.</w:t>
       </w:r>
     </w:p>
     <w:p>
@@ -4158,7 +4574,52 @@
         <w:spacing w:after="90" w:line="270"/>
       </w:pPr>
       <w:r>
-        <w:t xml:space="preserve">Для каждого среза строится маска тела: кандидаты имеют HU &gt; −350, затем с помощью обхода в ширину оставляется крупнейшая связная 2D-компонента. Это удаляет стол томографа и внешний фон.</w:t>
+        <w:t xml:space="preserve">Связная компонента — группа соседних активных пикселей или вокселей, между которыми можно пройти, не выходя на фон. Для каждого среза программа сначала отмечает пиксели с HU &gt; −350, затем обходом в ширину находит компоненты и оставляет крупнейшую связную 2D-компоненту как грубую маску тела. Это помогает убрать воздух, стол томографа и отдельные внешние объекты.</w:t>
+      </w:r>
+    </w:p>
+    <w:p>
+      <w:pPr>
+        <w:spacing w:before="80" w:after="120" w:line="280" w:lineRule="auto"/>
+        <w:shd w:val="clear" w:color="auto" w:fill="EAF2F0"/>
+      </w:pPr>
+      <w:r>
+        <w:rPr>
+          <w:b/>
+          <w:color w:val="2A7469"/>
+          <w:sz w:val="22"/>
+          <w:rFonts w:ascii="Arial" w:hAnsi="Arial" w:cs="Arial"/>
+        </w:rPr>
+        <w:t xml:space="preserve">Простыми словами: </w:t>
+      </w:r>
+      <w:r>
+        <w:rPr>
+          <w:color w:val="1F2B2A"/>
+          <w:sz w:val="22"/>
+          <w:rFonts w:ascii="Arial" w:hAnsi="Arial" w:cs="Arial"/>
+        </w:rPr>
+        <w:t xml:space="preserve">программа находит отдельные цельные группы точек и может отличить основное тело от отдельно стоящего стола или шума.</w:t>
+      </w:r>
+    </w:p>
+    <w:p>
+      <w:pPr>
+        <w:spacing w:before="80" w:after="120" w:line="280" w:lineRule="auto"/>
+      </w:pPr>
+      <w:r>
+        <w:rPr>
+          <w:b/>
+          <w:color w:val="2A7469"/>
+          <w:sz w:val="22"/>
+          <w:rFonts w:ascii="Arial" w:hAnsi="Arial" w:cs="Arial"/>
+        </w:rPr>
+        <w:t xml:space="preserve">Подробнее: </w:t>
+      </w:r>
+      <w:r>
+        <w:rPr>
+          <w:color w:val="1F2B2A"/>
+          <w:sz w:val="22"/>
+          <w:rFonts w:ascii="Arial" w:hAnsi="Arial" w:cs="Arial"/>
+        </w:rPr>
+        <w:t xml:space="preserve">на двумерном срезе компоненты ищутся обходом в ширину по четырем соседям: слева, справа, сверху и снизу. Кандидатами служат пиксели с HU выше −350, что грубо исключает воздух. Сохраняется крупнейшая компонента как маска основной области тела. Ограничение: если полезная область физически отделена от основной, эта вспомогательная маска может ее исключить.</w:t>
       </w:r>
     </w:p>
     <w:p>
@@ -4176,6 +4637,51 @@
     </w:p>
     <w:p>
       <w:pPr>
+        <w:spacing w:before="80" w:after="120" w:line="280" w:lineRule="auto"/>
+        <w:shd w:val="clear" w:color="auto" w:fill="EAF2F0"/>
+      </w:pPr>
+      <w:r>
+        <w:rPr>
+          <w:b/>
+          <w:color w:val="2A7469"/>
+          <w:sz w:val="22"/>
+          <w:rFonts w:ascii="Arial" w:hAnsi="Arial" w:cs="Arial"/>
+        </w:rPr>
+        <w:t xml:space="preserve">Простыми словами: </w:t>
+      </w:r>
+      <w:r>
+        <w:rPr>
+          <w:color w:val="1F2B2A"/>
+          <w:sz w:val="22"/>
+          <w:rFonts w:ascii="Arial" w:hAnsi="Arial" w:cs="Arial"/>
+        </w:rPr>
+        <w:t xml:space="preserve">одинокие точки без нормального окружения считаются шумом и удаляются.</w:t>
+      </w:r>
+    </w:p>
+    <w:p>
+      <w:pPr>
+        <w:spacing w:before="80" w:after="120" w:line="280" w:lineRule="auto"/>
+      </w:pPr>
+      <w:r>
+        <w:rPr>
+          <w:b/>
+          <w:color w:val="2A7469"/>
+          <w:sz w:val="22"/>
+          <w:rFonts w:ascii="Arial" w:hAnsi="Arial" w:cs="Arial"/>
+        </w:rPr>
+        <w:t xml:space="preserve">Подробнее: </w:t>
+      </w:r>
+      <w:r>
+        <w:rPr>
+          <w:color w:val="1F2B2A"/>
+          <w:sz w:val="22"/>
+          <w:rFonts w:ascii="Arial" w:hAnsi="Arial" w:cs="Arial"/>
+        </w:rPr>
+        <w:t xml:space="preserve">для активного вокселя просматривается 26-окрестность 3×3×3 без центральной ячейки. Он сохраняется, если найдено минимум два активных соседа. Проверка использует исходный набор активных вокселей одного этапа, поэтому результат не зависит от порядка перебора.</w:t>
+      </w:r>
+    </w:p>
+    <w:p>
+      <w:pPr>
         <w:pStyle w:val="ListParagraph"/>
         <w:numPr>
           <w:ilvl w:val="0"/>
@@ -4189,6 +4695,51 @@
     </w:p>
     <w:p>
       <w:pPr>
+        <w:spacing w:before="80" w:after="120" w:line="280" w:lineRule="auto"/>
+        <w:shd w:val="clear" w:color="auto" w:fill="EAF2F0"/>
+      </w:pPr>
+      <w:r>
+        <w:rPr>
+          <w:b/>
+          <w:color w:val="2A7469"/>
+          <w:sz w:val="22"/>
+          <w:rFonts w:ascii="Arial" w:hAnsi="Arial" w:cs="Arial"/>
+        </w:rPr>
+        <w:t xml:space="preserve">Простыми словами: </w:t>
+      </w:r>
+      <w:r>
+        <w:rPr>
+          <w:color w:val="1F2B2A"/>
+          <w:sz w:val="22"/>
+          <w:rFonts w:ascii="Arial" w:hAnsi="Arial" w:cs="Arial"/>
+        </w:rPr>
+        <w:t xml:space="preserve">маленькие отдельные группы точек удаляются, а достаточно крупные части сохраняются.</w:t>
+      </w:r>
+    </w:p>
+    <w:p>
+      <w:pPr>
+        <w:spacing w:before="80" w:after="120" w:line="280" w:lineRule="auto"/>
+      </w:pPr>
+      <w:r>
+        <w:rPr>
+          <w:b/>
+          <w:color w:val="2A7469"/>
+          <w:sz w:val="22"/>
+          <w:rFonts w:ascii="Arial" w:hAnsi="Arial" w:cs="Arial"/>
+        </w:rPr>
+        <w:t xml:space="preserve">Подробнее: </w:t>
+      </w:r>
+      <w:r>
+        <w:rPr>
+          <w:color w:val="1F2B2A"/>
+          <w:sz w:val="22"/>
+          <w:rFonts w:ascii="Arial" w:hAnsi="Arial" w:cs="Arial"/>
+        </w:rPr>
+        <w:t xml:space="preserve">компоненты находятся обходом в ширину с 26-связностью. Порог 64 вокселя подавляет небольшие островки шума. Программа намеренно сохраняет не только крупнейшую компоненту, потому что отдельные кости и другие полезные структуры могут не соприкасаться между собой. Ограничение: действительно полезная структура меньше порога тоже может исчезнуть.</w:t>
+      </w:r>
+    </w:p>
+    <w:p>
+      <w:pPr>
         <w:pStyle w:val="ListParagraph"/>
         <w:numPr>
           <w:ilvl w:val="0"/>
@@ -4202,6 +4753,51 @@
     </w:p>
     <w:p>
       <w:pPr>
+        <w:spacing w:before="80" w:after="120" w:line="280" w:lineRule="auto"/>
+        <w:shd w:val="clear" w:color="auto" w:fill="EAF2F0"/>
+      </w:pPr>
+      <w:r>
+        <w:rPr>
+          <w:b/>
+          <w:color w:val="2A7469"/>
+          <w:sz w:val="22"/>
+          <w:rFonts w:ascii="Arial" w:hAnsi="Arial" w:cs="Arial"/>
+        </w:rPr>
+        <w:t xml:space="preserve">Простыми словами: </w:t>
+      </w:r>
+      <w:r>
+        <w:rPr>
+          <w:color w:val="1F2B2A"/>
+          <w:sz w:val="22"/>
+          <w:rFonts w:ascii="Arial" w:hAnsi="Arial" w:cs="Arial"/>
+        </w:rPr>
+        <w:t xml:space="preserve">точки внутри сплошного объема не рисуются, потому что снаружи их все равно не видно.</w:t>
+      </w:r>
+    </w:p>
+    <w:p>
+      <w:pPr>
+        <w:spacing w:before="80" w:after="120" w:line="280" w:lineRule="auto"/>
+      </w:pPr>
+      <w:r>
+        <w:rPr>
+          <w:b/>
+          <w:color w:val="2A7469"/>
+          <w:sz w:val="22"/>
+          <w:rFonts w:ascii="Arial" w:hAnsi="Arial" w:cs="Arial"/>
+        </w:rPr>
+        <w:t xml:space="preserve">Подробнее: </w:t>
+      </w:r>
+      <w:r>
+        <w:rPr>
+          <w:color w:val="1F2B2A"/>
+          <w:sz w:val="22"/>
+          <w:rFonts w:ascii="Arial" w:hAnsi="Arial" w:cs="Arial"/>
+        </w:rPr>
+        <w:t xml:space="preserve">воксель считается поверхностным, если хотя бы один из шести соседей по направлениям ±X, ±Y, ±Z неактивен или находится за границей объема. Это не вычисление медицинского контура и не Marching Cubes, а простое извлечение дискретной поверхности. Оно существенно уменьшает число точек, сохраняя внешнюю форму.</w:t>
+      </w:r>
+    </w:p>
+    <w:p>
+      <w:pPr>
         <w:pStyle w:val="ListParagraph"/>
         <w:numPr>
           <w:ilvl w:val="0"/>
@@ -4241,6 +4837,51 @@
     </w:p>
     <w:p>
       <w:pPr>
+        <w:spacing w:before="80" w:after="120" w:line="280" w:lineRule="auto"/>
+        <w:shd w:val="clear" w:color="auto" w:fill="EAF2F0"/>
+      </w:pPr>
+      <w:r>
+        <w:rPr>
+          <w:b/>
+          <w:color w:val="2A7469"/>
+          <w:sz w:val="22"/>
+          <w:rFonts w:ascii="Arial" w:hAnsi="Arial" w:cs="Arial"/>
+        </w:rPr>
+        <w:t xml:space="preserve">Простыми словами: </w:t>
+      </w:r>
+      <w:r>
+        <w:rPr>
+          <w:color w:val="1F2B2A"/>
+          <w:sz w:val="22"/>
+          <w:rFonts w:ascii="Arial" w:hAnsi="Arial" w:cs="Arial"/>
+        </w:rPr>
+        <w:t xml:space="preserve">слишком большое облако равномерно прореживается, чтобы окно не тормозило.</w:t>
+      </w:r>
+    </w:p>
+    <w:p>
+      <w:pPr>
+        <w:spacing w:before="80" w:after="120" w:line="280" w:lineRule="auto"/>
+      </w:pPr>
+      <w:r>
+        <w:rPr>
+          <w:b/>
+          <w:color w:val="2A7469"/>
+          <w:sz w:val="22"/>
+          <w:rFonts w:ascii="Arial" w:hAnsi="Arial" w:cs="Arial"/>
+        </w:rPr>
+        <w:t xml:space="preserve">Подробнее: </w:t>
+      </w:r>
+      <w:r>
+        <w:rPr>
+          <w:color w:val="1F2B2A"/>
+          <w:sz w:val="22"/>
+          <w:rFonts w:ascii="Arial" w:hAnsi="Arial" w:cs="Arial"/>
+        </w:rPr>
+        <w:t xml:space="preserve">децимация выбирает не случайные точки, а равномерные позиции из сформированного списка с вычисленным stride. Ограничение 260 000 относится только к отображаемому облаку и не изменяет исходные DICOM-данные. Компромисс — высокая интерактивность ценой части мелких визуальных деталей.</w:t>
+      </w:r>
+    </w:p>
+    <w:p>
+      <w:pPr>
         <w:pStyle w:val="Heading2"/>
         <w:spacing w:after="100" w:before="220"/>
       </w:pPr>
@@ -4266,7 +4907,7 @@
         <w:spacing w:after="120" w:line="280"/>
       </w:pPr>
       <w:r>
-        <w:t xml:space="preserve">Для очистки используется 26-связность: учитываются соседи по сторонам, ребрам и углам куба. Для определения поверхности используется более строгая проверка шести соседей по основным осям. Если с одной стороны пустота, воксель находится на поверхности.</w:t>
+        <w:t xml:space="preserve">Связность определяет, какие соседние ячейки считаются частью одной области. При 26-связности в 3D учитываются все соседи куба: по сторонам, ребрам и углам. Для определения поверхности используется проверка шести соседей только по основным осям. Если хотя бы с одной стороны сосед отсутствует, воксель считается поверхностным.</w:t>
       </w:r>
     </w:p>
     <w:p>
@@ -4281,6 +4922,65 @@
           <w:color w:val="1F2B2A"/>
         </w:rPr>
         <w:t xml:space="preserve">Физические координаты</w:t>
+      </w:r>
+    </w:p>
+    <w:p>
+      <w:pPr>
+        <w:spacing w:after="120" w:line="280" w:lineRule="auto"/>
+      </w:pPr>
+      <w:r>
+        <w:rPr>
+          <w:color w:val="1F2B2A"/>
+          <w:sz w:val="22"/>
+          <w:szCs w:val="22"/>
+          <w:rFonts w:ascii="Arial" w:hAnsi="Arial" w:cs="Arial"/>
+        </w:rPr>
+        <w:t xml:space="preserve">Физические координаты выражают положение не в номерах пикселей, а в реальных расстояниях, обычно миллиметрах. Они нужны, чтобы при построении учитывать настоящий размер пикселей и расстояние между срезами, сохраняя пропорции объекта.</w:t>
+      </w:r>
+    </w:p>
+    <w:p>
+      <w:pPr>
+        <w:spacing w:before="80" w:after="120" w:line="280" w:lineRule="auto"/>
+        <w:shd w:val="clear" w:color="auto" w:fill="EAF2F0"/>
+      </w:pPr>
+      <w:r>
+        <w:rPr>
+          <w:b/>
+          <w:color w:val="2A7469"/>
+          <w:sz w:val="22"/>
+          <w:rFonts w:ascii="Arial" w:hAnsi="Arial" w:cs="Arial"/>
+        </w:rPr>
+        <w:t xml:space="preserve">Простыми словами: </w:t>
+      </w:r>
+      <w:r>
+        <w:rPr>
+          <w:color w:val="1F2B2A"/>
+          <w:sz w:val="22"/>
+          <w:rFonts w:ascii="Arial" w:hAnsi="Arial" w:cs="Arial"/>
+        </w:rPr>
+        <w:t xml:space="preserve">программа учитывает реальные миллиметры, чтобы срезы не выглядели случайно растянутыми или сжатыми.</w:t>
+      </w:r>
+    </w:p>
+    <w:p>
+      <w:pPr>
+        <w:spacing w:before="80" w:after="120" w:line="280" w:lineRule="auto"/>
+      </w:pPr>
+      <w:r>
+        <w:rPr>
+          <w:b/>
+          <w:color w:val="2A7469"/>
+          <w:sz w:val="22"/>
+          <w:rFonts w:ascii="Arial" w:hAnsi="Arial" w:cs="Arial"/>
+        </w:rPr>
+        <w:t xml:space="preserve">Подробнее: </w:t>
+      </w:r>
+      <w:r>
+        <w:rPr>
+          <w:color w:val="1F2B2A"/>
+          <w:sz w:val="22"/>
+          <w:rFonts w:ascii="Arial" w:hAnsi="Arial" w:cs="Arial"/>
+        </w:rPr>
+        <w:t xml:space="preserve">индексы пикселей умножаются на PixelSpacing, а Z берется из ImagePositionPatient; если точной Z-координаты нет, используется SliceThickness. Координаты центрируются вокруг нуля для удобного вращения. Это сохраняет масштаб осей, но проект не применяет полную матрицу ориентации пациента.</w:t>
       </w:r>
     </w:p>
     <w:p>
@@ -4427,7 +5127,52 @@
         <w:spacing w:after="120" w:line="280"/>
       </w:pPr>
       <w:r>
-        <w:t xml:space="preserve">Это программная ортографическая проекция средствами Java2D, без OpenGL и без перспективного деления.</w:t>
+        <w:t xml:space="preserve">Проекция — правило преобразования трехмерных координат в двумерные координаты экрана. Здесь используется ортографическая проекция средствами Java2D: размер объекта не уменьшается с расстоянием до камеры, а глубина применяется для порядка отрисовки, небольшого изменения яркости и размера точек. OpenGL и перспективное деление не используются.</w:t>
+      </w:r>
+    </w:p>
+    <w:p>
+      <w:pPr>
+        <w:spacing w:before="80" w:after="120" w:line="280" w:lineRule="auto"/>
+        <w:shd w:val="clear" w:color="auto" w:fill="EAF2F0"/>
+      </w:pPr>
+      <w:r>
+        <w:rPr>
+          <w:b/>
+          <w:color w:val="2A7469"/>
+          <w:sz w:val="22"/>
+          <w:rFonts w:ascii="Arial" w:hAnsi="Arial" w:cs="Arial"/>
+        </w:rPr>
+        <w:t xml:space="preserve">Простыми словами: </w:t>
+      </w:r>
+      <w:r>
+        <w:rPr>
+          <w:color w:val="1F2B2A"/>
+          <w:sz w:val="22"/>
+          <w:rFonts w:ascii="Arial" w:hAnsi="Arial" w:cs="Arial"/>
+        </w:rPr>
+        <w:t xml:space="preserve">трехмерные точки поворачиваются и переводятся в координаты обычного двумерного окна.</w:t>
+      </w:r>
+    </w:p>
+    <w:p>
+      <w:pPr>
+        <w:spacing w:before="80" w:after="120" w:line="280" w:lineRule="auto"/>
+      </w:pPr>
+      <w:r>
+        <w:rPr>
+          <w:b/>
+          <w:color w:val="2A7469"/>
+          <w:sz w:val="22"/>
+          <w:rFonts w:ascii="Arial" w:hAnsi="Arial" w:cs="Arial"/>
+        </w:rPr>
+        <w:t xml:space="preserve">Подробнее: </w:t>
+      </w:r>
+      <w:r>
+        <w:rPr>
+          <w:color w:val="1F2B2A"/>
+          <w:sz w:val="22"/>
+          <w:rFonts w:ascii="Arial" w:hAnsi="Arial" w:cs="Arial"/>
+        </w:rPr>
+        <w:t xml:space="preserve">сначала применяются повороты вокруг Y и X, затем ортографическое масштабирование. Точки сортируются по глубине и рисуются от дальних к ближним, что является простым вариантом painter’s algorithm. Это визуальная отрисовка облака, а не физический объемный рендеринг с лучами или поверхностным освещением.</w:t>
       </w:r>
     </w:p>
     <w:p>

</xml_diff>

<commit_message>
Fix guide list numbering
</commit_message>
<xml_diff>
--- a/docs/Шпаргалка для защиты DICOM-проекта.docx
+++ b/docs/Шпаргалка для защиты DICOM-проекта.docx
@@ -139,7 +139,7 @@
         <w:pStyle w:val="ListParagraph"/>
         <w:numPr>
           <w:ilvl w:val="0"/>
-          <w:numId w:val="1"/>
+          <w:numId w:val="3"/>
         </w:numPr>
         <w:spacing w:after="70" w:line="260"/>
       </w:pPr>
@@ -152,7 +152,7 @@
         <w:pStyle w:val="ListParagraph"/>
         <w:numPr>
           <w:ilvl w:val="0"/>
-          <w:numId w:val="1"/>
+          <w:numId w:val="3"/>
         </w:numPr>
         <w:spacing w:after="70" w:line="260"/>
       </w:pPr>
@@ -165,7 +165,7 @@
         <w:pStyle w:val="ListParagraph"/>
         <w:numPr>
           <w:ilvl w:val="0"/>
-          <w:numId w:val="1"/>
+          <w:numId w:val="3"/>
         </w:numPr>
         <w:spacing w:after="70" w:line="260"/>
       </w:pPr>
@@ -178,7 +178,7 @@
         <w:pStyle w:val="ListParagraph"/>
         <w:numPr>
           <w:ilvl w:val="0"/>
-          <w:numId w:val="1"/>
+          <w:numId w:val="3"/>
         </w:numPr>
         <w:spacing w:after="70" w:line="260"/>
       </w:pPr>
@@ -270,7 +270,7 @@
         <w:pStyle w:val="ListParagraph"/>
         <w:numPr>
           <w:ilvl w:val="0"/>
-          <w:numId w:val="2"/>
+          <w:numId w:val="4"/>
         </w:numPr>
         <w:spacing w:after="90" w:line="270"/>
       </w:pPr>
@@ -283,7 +283,7 @@
         <w:pStyle w:val="ListParagraph"/>
         <w:numPr>
           <w:ilvl w:val="0"/>
-          <w:numId w:val="2"/>
+          <w:numId w:val="4"/>
         </w:numPr>
         <w:spacing w:after="90" w:line="270"/>
       </w:pPr>
@@ -296,7 +296,7 @@
         <w:pStyle w:val="ListParagraph"/>
         <w:numPr>
           <w:ilvl w:val="0"/>
-          <w:numId w:val="2"/>
+          <w:numId w:val="4"/>
         </w:numPr>
         <w:spacing w:after="90" w:line="270"/>
       </w:pPr>
@@ -309,7 +309,7 @@
         <w:pStyle w:val="ListParagraph"/>
         <w:numPr>
           <w:ilvl w:val="0"/>
-          <w:numId w:val="2"/>
+          <w:numId w:val="4"/>
         </w:numPr>
         <w:spacing w:after="90" w:line="270"/>
       </w:pPr>
@@ -322,7 +322,7 @@
         <w:pStyle w:val="ListParagraph"/>
         <w:numPr>
           <w:ilvl w:val="0"/>
-          <w:numId w:val="2"/>
+          <w:numId w:val="4"/>
         </w:numPr>
         <w:spacing w:after="90" w:line="270"/>
       </w:pPr>
@@ -335,7 +335,7 @@
         <w:pStyle w:val="ListParagraph"/>
         <w:numPr>
           <w:ilvl w:val="0"/>
-          <w:numId w:val="2"/>
+          <w:numId w:val="4"/>
         </w:numPr>
         <w:spacing w:after="90" w:line="270"/>
       </w:pPr>
@@ -348,7 +348,7 @@
         <w:pStyle w:val="ListParagraph"/>
         <w:numPr>
           <w:ilvl w:val="0"/>
-          <w:numId w:val="2"/>
+          <w:numId w:val="4"/>
         </w:numPr>
         <w:spacing w:after="90" w:line="270"/>
       </w:pPr>
@@ -361,7 +361,7 @@
         <w:pStyle w:val="ListParagraph"/>
         <w:numPr>
           <w:ilvl w:val="0"/>
-          <w:numId w:val="2"/>
+          <w:numId w:val="4"/>
         </w:numPr>
         <w:spacing w:after="90" w:line="270"/>
       </w:pPr>
@@ -918,7 +918,7 @@
         <w:pStyle w:val="ListParagraph"/>
         <w:numPr>
           <w:ilvl w:val="0"/>
-          <w:numId w:val="2"/>
+          <w:numId w:val="5"/>
         </w:numPr>
         <w:spacing w:after="90" w:line="270"/>
       </w:pPr>
@@ -931,7 +931,7 @@
         <w:pStyle w:val="ListParagraph"/>
         <w:numPr>
           <w:ilvl w:val="0"/>
-          <w:numId w:val="2"/>
+          <w:numId w:val="5"/>
         </w:numPr>
         <w:spacing w:after="90" w:line="270"/>
       </w:pPr>
@@ -944,7 +944,7 @@
         <w:pStyle w:val="ListParagraph"/>
         <w:numPr>
           <w:ilvl w:val="0"/>
-          <w:numId w:val="2"/>
+          <w:numId w:val="5"/>
         </w:numPr>
         <w:spacing w:after="90" w:line="270"/>
       </w:pPr>
@@ -957,7 +957,7 @@
         <w:pStyle w:val="ListParagraph"/>
         <w:numPr>
           <w:ilvl w:val="0"/>
-          <w:numId w:val="2"/>
+          <w:numId w:val="5"/>
         </w:numPr>
         <w:spacing w:after="90" w:line="270"/>
       </w:pPr>
@@ -970,7 +970,7 @@
         <w:pStyle w:val="ListParagraph"/>
         <w:numPr>
           <w:ilvl w:val="0"/>
-          <w:numId w:val="2"/>
+          <w:numId w:val="5"/>
         </w:numPr>
         <w:spacing w:after="90" w:line="270"/>
       </w:pPr>
@@ -983,7 +983,7 @@
         <w:pStyle w:val="ListParagraph"/>
         <w:numPr>
           <w:ilvl w:val="0"/>
-          <w:numId w:val="2"/>
+          <w:numId w:val="5"/>
         </w:numPr>
         <w:spacing w:after="90" w:line="270"/>
       </w:pPr>
@@ -996,7 +996,7 @@
         <w:pStyle w:val="ListParagraph"/>
         <w:numPr>
           <w:ilvl w:val="0"/>
-          <w:numId w:val="2"/>
+          <w:numId w:val="5"/>
         </w:numPr>
         <w:spacing w:after="90" w:line="270"/>
       </w:pPr>
@@ -1009,7 +1009,7 @@
         <w:pStyle w:val="ListParagraph"/>
         <w:numPr>
           <w:ilvl w:val="0"/>
-          <w:numId w:val="2"/>
+          <w:numId w:val="5"/>
         </w:numPr>
         <w:spacing w:after="90" w:line="270"/>
       </w:pPr>
@@ -1022,7 +1022,7 @@
         <w:pStyle w:val="ListParagraph"/>
         <w:numPr>
           <w:ilvl w:val="0"/>
-          <w:numId w:val="2"/>
+          <w:numId w:val="5"/>
         </w:numPr>
         <w:spacing w:after="90" w:line="270"/>
       </w:pPr>
@@ -1035,7 +1035,7 @@
         <w:pStyle w:val="ListParagraph"/>
         <w:numPr>
           <w:ilvl w:val="0"/>
-          <w:numId w:val="2"/>
+          <w:numId w:val="5"/>
         </w:numPr>
         <w:spacing w:after="90" w:line="270"/>
       </w:pPr>
@@ -1837,7 +1837,7 @@
         <w:pStyle w:val="ListParagraph"/>
         <w:numPr>
           <w:ilvl w:val="0"/>
-          <w:numId w:val="2"/>
+          <w:numId w:val="6"/>
         </w:numPr>
         <w:spacing w:after="90" w:line="270"/>
       </w:pPr>
@@ -1850,7 +1850,7 @@
         <w:pStyle w:val="ListParagraph"/>
         <w:numPr>
           <w:ilvl w:val="0"/>
-          <w:numId w:val="2"/>
+          <w:numId w:val="6"/>
         </w:numPr>
         <w:spacing w:after="90" w:line="270"/>
       </w:pPr>
@@ -1863,7 +1863,7 @@
         <w:pStyle w:val="ListParagraph"/>
         <w:numPr>
           <w:ilvl w:val="0"/>
-          <w:numId w:val="2"/>
+          <w:numId w:val="6"/>
         </w:numPr>
         <w:spacing w:after="90" w:line="270"/>
       </w:pPr>
@@ -1876,7 +1876,7 @@
         <w:pStyle w:val="ListParagraph"/>
         <w:numPr>
           <w:ilvl w:val="0"/>
-          <w:numId w:val="2"/>
+          <w:numId w:val="6"/>
         </w:numPr>
         <w:spacing w:after="90" w:line="270"/>
       </w:pPr>
@@ -1889,7 +1889,7 @@
         <w:pStyle w:val="ListParagraph"/>
         <w:numPr>
           <w:ilvl w:val="0"/>
-          <w:numId w:val="2"/>
+          <w:numId w:val="6"/>
         </w:numPr>
         <w:spacing w:after="90" w:line="270"/>
       </w:pPr>
@@ -1902,7 +1902,7 @@
         <w:pStyle w:val="ListParagraph"/>
         <w:numPr>
           <w:ilvl w:val="0"/>
-          <w:numId w:val="2"/>
+          <w:numId w:val="6"/>
         </w:numPr>
         <w:spacing w:after="90" w:line="270"/>
       </w:pPr>
@@ -1915,7 +1915,7 @@
         <w:pStyle w:val="ListParagraph"/>
         <w:numPr>
           <w:ilvl w:val="0"/>
-          <w:numId w:val="2"/>
+          <w:numId w:val="6"/>
         </w:numPr>
         <w:spacing w:after="90" w:line="270"/>
       </w:pPr>
@@ -4177,7 +4177,7 @@
         <w:pStyle w:val="ListParagraph"/>
         <w:numPr>
           <w:ilvl w:val="0"/>
-          <w:numId w:val="1"/>
+          <w:numId w:val="7"/>
         </w:numPr>
         <w:spacing w:after="70" w:line="260"/>
       </w:pPr>
@@ -4190,7 +4190,7 @@
         <w:pStyle w:val="ListParagraph"/>
         <w:numPr>
           <w:ilvl w:val="0"/>
-          <w:numId w:val="1"/>
+          <w:numId w:val="7"/>
         </w:numPr>
         <w:spacing w:after="70" w:line="260"/>
       </w:pPr>
@@ -4203,7 +4203,7 @@
         <w:pStyle w:val="ListParagraph"/>
         <w:numPr>
           <w:ilvl w:val="0"/>
-          <w:numId w:val="1"/>
+          <w:numId w:val="7"/>
         </w:numPr>
         <w:spacing w:after="70" w:line="260"/>
       </w:pPr>
@@ -4440,7 +4440,7 @@
         <w:pStyle w:val="ListParagraph"/>
         <w:numPr>
           <w:ilvl w:val="0"/>
-          <w:numId w:val="2"/>
+          <w:numId w:val="8"/>
         </w:numPr>
         <w:spacing w:after="90" w:line="270"/>
       </w:pPr>
@@ -4453,7 +4453,7 @@
         <w:pStyle w:val="ListParagraph"/>
         <w:numPr>
           <w:ilvl w:val="0"/>
-          <w:numId w:val="2"/>
+          <w:numId w:val="8"/>
         </w:numPr>
         <w:spacing w:after="90" w:line="270"/>
       </w:pPr>
@@ -4511,7 +4511,7 @@
         <w:pStyle w:val="ListParagraph"/>
         <w:numPr>
           <w:ilvl w:val="0"/>
-          <w:numId w:val="2"/>
+          <w:numId w:val="8"/>
         </w:numPr>
         <w:spacing w:after="90" w:line="270"/>
       </w:pPr>
@@ -4569,7 +4569,7 @@
         <w:pStyle w:val="ListParagraph"/>
         <w:numPr>
           <w:ilvl w:val="0"/>
-          <w:numId w:val="2"/>
+          <w:numId w:val="8"/>
         </w:numPr>
         <w:spacing w:after="90" w:line="270"/>
       </w:pPr>
@@ -4627,7 +4627,7 @@
         <w:pStyle w:val="ListParagraph"/>
         <w:numPr>
           <w:ilvl w:val="0"/>
-          <w:numId w:val="2"/>
+          <w:numId w:val="8"/>
         </w:numPr>
         <w:spacing w:after="90" w:line="270"/>
       </w:pPr>
@@ -4685,7 +4685,7 @@
         <w:pStyle w:val="ListParagraph"/>
         <w:numPr>
           <w:ilvl w:val="0"/>
-          <w:numId w:val="2"/>
+          <w:numId w:val="8"/>
         </w:numPr>
         <w:spacing w:after="90" w:line="270"/>
       </w:pPr>
@@ -4743,7 +4743,7 @@
         <w:pStyle w:val="ListParagraph"/>
         <w:numPr>
           <w:ilvl w:val="0"/>
-          <w:numId w:val="2"/>
+          <w:numId w:val="8"/>
         </w:numPr>
         <w:spacing w:after="90" w:line="270"/>
       </w:pPr>
@@ -4801,7 +4801,7 @@
         <w:pStyle w:val="ListParagraph"/>
         <w:numPr>
           <w:ilvl w:val="0"/>
-          <w:numId w:val="2"/>
+          <w:numId w:val="8"/>
         </w:numPr>
         <w:spacing w:after="90" w:line="270"/>
       </w:pPr>
@@ -4814,7 +4814,7 @@
         <w:pStyle w:val="ListParagraph"/>
         <w:numPr>
           <w:ilvl w:val="0"/>
-          <w:numId w:val="2"/>
+          <w:numId w:val="8"/>
         </w:numPr>
         <w:spacing w:after="90" w:line="270"/>
       </w:pPr>
@@ -4827,7 +4827,7 @@
         <w:pStyle w:val="ListParagraph"/>
         <w:numPr>
           <w:ilvl w:val="0"/>
-          <w:numId w:val="2"/>
+          <w:numId w:val="8"/>
         </w:numPr>
         <w:spacing w:after="90" w:line="270"/>
       </w:pPr>
@@ -5075,7 +5075,7 @@
         <w:pStyle w:val="ListParagraph"/>
         <w:numPr>
           <w:ilvl w:val="0"/>
-          <w:numId w:val="1"/>
+          <w:numId w:val="9"/>
         </w:numPr>
         <w:spacing w:after="70" w:line="260"/>
       </w:pPr>
@@ -5088,7 +5088,7 @@
         <w:pStyle w:val="ListParagraph"/>
         <w:numPr>
           <w:ilvl w:val="0"/>
-          <w:numId w:val="1"/>
+          <w:numId w:val="9"/>
         </w:numPr>
         <w:spacing w:after="70" w:line="260"/>
       </w:pPr>
@@ -5101,7 +5101,7 @@
         <w:pStyle w:val="ListParagraph"/>
         <w:numPr>
           <w:ilvl w:val="0"/>
-          <w:numId w:val="1"/>
+          <w:numId w:val="9"/>
         </w:numPr>
         <w:spacing w:after="70" w:line="260"/>
       </w:pPr>
@@ -5114,7 +5114,7 @@
         <w:pStyle w:val="ListParagraph"/>
         <w:numPr>
           <w:ilvl w:val="0"/>
-          <w:numId w:val="1"/>
+          <w:numId w:val="9"/>
         </w:numPr>
         <w:spacing w:after="70" w:line="260"/>
       </w:pPr>
@@ -8020,7 +8020,7 @@
         <w:pStyle w:val="ListParagraph"/>
         <w:numPr>
           <w:ilvl w:val="0"/>
-          <w:numId w:val="1"/>
+          <w:numId w:val="10"/>
         </w:numPr>
         <w:spacing w:after="70" w:line="260"/>
       </w:pPr>
@@ -8033,7 +8033,7 @@
         <w:pStyle w:val="ListParagraph"/>
         <w:numPr>
           <w:ilvl w:val="0"/>
-          <w:numId w:val="1"/>
+          <w:numId w:val="10"/>
         </w:numPr>
         <w:spacing w:after="70" w:line="260"/>
       </w:pPr>
@@ -8046,7 +8046,7 @@
         <w:pStyle w:val="ListParagraph"/>
         <w:numPr>
           <w:ilvl w:val="0"/>
-          <w:numId w:val="1"/>
+          <w:numId w:val="10"/>
         </w:numPr>
         <w:spacing w:after="70" w:line="260"/>
       </w:pPr>
@@ -8059,7 +8059,7 @@
         <w:pStyle w:val="ListParagraph"/>
         <w:numPr>
           <w:ilvl w:val="0"/>
-          <w:numId w:val="1"/>
+          <w:numId w:val="10"/>
         </w:numPr>
         <w:spacing w:after="70" w:line="260"/>
       </w:pPr>
@@ -8072,7 +8072,7 @@
         <w:pStyle w:val="ListParagraph"/>
         <w:numPr>
           <w:ilvl w:val="0"/>
-          <w:numId w:val="1"/>
+          <w:numId w:val="10"/>
         </w:numPr>
         <w:spacing w:after="70" w:line="260"/>
       </w:pPr>
@@ -8085,7 +8085,7 @@
         <w:pStyle w:val="ListParagraph"/>
         <w:numPr>
           <w:ilvl w:val="0"/>
-          <w:numId w:val="1"/>
+          <w:numId w:val="10"/>
         </w:numPr>
         <w:spacing w:after="70" w:line="260"/>
       </w:pPr>
@@ -8098,7 +8098,7 @@
         <w:pStyle w:val="ListParagraph"/>
         <w:numPr>
           <w:ilvl w:val="0"/>
-          <w:numId w:val="1"/>
+          <w:numId w:val="10"/>
         </w:numPr>
         <w:spacing w:after="70" w:line="260"/>
       </w:pPr>
@@ -8111,7 +8111,7 @@
         <w:pStyle w:val="ListParagraph"/>
         <w:numPr>
           <w:ilvl w:val="0"/>
-          <w:numId w:val="1"/>
+          <w:numId w:val="10"/>
         </w:numPr>
         <w:spacing w:after="70" w:line="260"/>
       </w:pPr>
@@ -8124,7 +8124,7 @@
         <w:pStyle w:val="ListParagraph"/>
         <w:numPr>
           <w:ilvl w:val="0"/>
-          <w:numId w:val="1"/>
+          <w:numId w:val="10"/>
         </w:numPr>
         <w:spacing w:after="70" w:line="260"/>
       </w:pPr>
@@ -8278,7 +8278,7 @@
         <w:pStyle w:val="ListParagraph"/>
         <w:numPr>
           <w:ilvl w:val="0"/>
-          <w:numId w:val="1"/>
+          <w:numId w:val="11"/>
         </w:numPr>
         <w:spacing w:after="70" w:line="260"/>
       </w:pPr>
@@ -8291,7 +8291,7 @@
         <w:pStyle w:val="ListParagraph"/>
         <w:numPr>
           <w:ilvl w:val="0"/>
-          <w:numId w:val="1"/>
+          <w:numId w:val="11"/>
         </w:numPr>
         <w:spacing w:after="70" w:line="260"/>
       </w:pPr>
@@ -8304,7 +8304,7 @@
         <w:pStyle w:val="ListParagraph"/>
         <w:numPr>
           <w:ilvl w:val="0"/>
-          <w:numId w:val="1"/>
+          <w:numId w:val="11"/>
         </w:numPr>
         <w:spacing w:after="70" w:line="260"/>
       </w:pPr>
@@ -8971,7 +8971,7 @@
         <w:pStyle w:val="ListParagraph"/>
         <w:numPr>
           <w:ilvl w:val="0"/>
-          <w:numId w:val="1"/>
+          <w:numId w:val="12"/>
         </w:numPr>
         <w:spacing w:after="70" w:line="260"/>
       </w:pPr>
@@ -8984,7 +8984,7 @@
         <w:pStyle w:val="ListParagraph"/>
         <w:numPr>
           <w:ilvl w:val="0"/>
-          <w:numId w:val="1"/>
+          <w:numId w:val="12"/>
         </w:numPr>
         <w:spacing w:after="70" w:line="260"/>
       </w:pPr>
@@ -8997,7 +8997,7 @@
         <w:pStyle w:val="ListParagraph"/>
         <w:numPr>
           <w:ilvl w:val="0"/>
-          <w:numId w:val="1"/>
+          <w:numId w:val="12"/>
         </w:numPr>
         <w:spacing w:after="70" w:line="260"/>
       </w:pPr>
@@ -9010,7 +9010,7 @@
         <w:pStyle w:val="ListParagraph"/>
         <w:numPr>
           <w:ilvl w:val="0"/>
-          <w:numId w:val="1"/>
+          <w:numId w:val="12"/>
         </w:numPr>
         <w:spacing w:after="70" w:line="260"/>
       </w:pPr>
@@ -9023,7 +9023,7 @@
         <w:pStyle w:val="ListParagraph"/>
         <w:numPr>
           <w:ilvl w:val="0"/>
-          <w:numId w:val="1"/>
+          <w:numId w:val="12"/>
         </w:numPr>
         <w:spacing w:after="70" w:line="260"/>
       </w:pPr>
@@ -9050,7 +9050,7 @@
         <w:pStyle w:val="ListParagraph"/>
         <w:numPr>
           <w:ilvl w:val="0"/>
-          <w:numId w:val="1"/>
+          <w:numId w:val="13"/>
         </w:numPr>
         <w:spacing w:after="70" w:line="260"/>
       </w:pPr>
@@ -9063,7 +9063,7 @@
         <w:pStyle w:val="ListParagraph"/>
         <w:numPr>
           <w:ilvl w:val="0"/>
-          <w:numId w:val="1"/>
+          <w:numId w:val="13"/>
         </w:numPr>
         <w:spacing w:after="70" w:line="260"/>
       </w:pPr>
@@ -9076,7 +9076,7 @@
         <w:pStyle w:val="ListParagraph"/>
         <w:numPr>
           <w:ilvl w:val="0"/>
-          <w:numId w:val="1"/>
+          <w:numId w:val="13"/>
         </w:numPr>
         <w:spacing w:after="70" w:line="260"/>
       </w:pPr>
@@ -9421,7 +9421,7 @@
         <w:pStyle w:val="ListParagraph"/>
         <w:numPr>
           <w:ilvl w:val="0"/>
-          <w:numId w:val="2"/>
+          <w:numId w:val="14"/>
         </w:numPr>
         <w:spacing w:after="90" w:line="270"/>
       </w:pPr>
@@ -9434,7 +9434,7 @@
         <w:pStyle w:val="ListParagraph"/>
         <w:numPr>
           <w:ilvl w:val="0"/>
-          <w:numId w:val="2"/>
+          <w:numId w:val="14"/>
         </w:numPr>
         <w:spacing w:after="90" w:line="270"/>
       </w:pPr>
@@ -9447,7 +9447,7 @@
         <w:pStyle w:val="ListParagraph"/>
         <w:numPr>
           <w:ilvl w:val="0"/>
-          <w:numId w:val="2"/>
+          <w:numId w:val="14"/>
         </w:numPr>
         <w:spacing w:after="90" w:line="270"/>
       </w:pPr>
@@ -9834,6 +9834,78 @@
     </w:lvlOverride>
   </w:num>
   <w:num w:numId="2">
+    <w:abstractNumId w:val="2"/>
+    <w:lvlOverride w:ilvl="0">
+      <w:startOverride w:val="1"/>
+    </w:lvlOverride>
+  </w:num>
+  <w:num w:numId="3">
+    <w:abstractNumId w:val="1"/>
+    <w:lvlOverride w:ilvl="0">
+      <w:startOverride w:val="1"/>
+    </w:lvlOverride>
+  </w:num>
+  <w:num w:numId="4">
+    <w:abstractNumId w:val="2"/>
+    <w:lvlOverride w:ilvl="0">
+      <w:startOverride w:val="1"/>
+    </w:lvlOverride>
+  </w:num>
+  <w:num w:numId="5">
+    <w:abstractNumId w:val="2"/>
+    <w:lvlOverride w:ilvl="0">
+      <w:startOverride w:val="1"/>
+    </w:lvlOverride>
+  </w:num>
+  <w:num w:numId="6">
+    <w:abstractNumId w:val="2"/>
+    <w:lvlOverride w:ilvl="0">
+      <w:startOverride w:val="1"/>
+    </w:lvlOverride>
+  </w:num>
+  <w:num w:numId="7">
+    <w:abstractNumId w:val="1"/>
+    <w:lvlOverride w:ilvl="0">
+      <w:startOverride w:val="1"/>
+    </w:lvlOverride>
+  </w:num>
+  <w:num w:numId="8">
+    <w:abstractNumId w:val="2"/>
+    <w:lvlOverride w:ilvl="0">
+      <w:startOverride w:val="1"/>
+    </w:lvlOverride>
+  </w:num>
+  <w:num w:numId="9">
+    <w:abstractNumId w:val="1"/>
+    <w:lvlOverride w:ilvl="0">
+      <w:startOverride w:val="1"/>
+    </w:lvlOverride>
+  </w:num>
+  <w:num w:numId="10">
+    <w:abstractNumId w:val="1"/>
+    <w:lvlOverride w:ilvl="0">
+      <w:startOverride w:val="1"/>
+    </w:lvlOverride>
+  </w:num>
+  <w:num w:numId="11">
+    <w:abstractNumId w:val="1"/>
+    <w:lvlOverride w:ilvl="0">
+      <w:startOverride w:val="1"/>
+    </w:lvlOverride>
+  </w:num>
+  <w:num w:numId="12">
+    <w:abstractNumId w:val="1"/>
+    <w:lvlOverride w:ilvl="0">
+      <w:startOverride w:val="1"/>
+    </w:lvlOverride>
+  </w:num>
+  <w:num w:numId="13">
+    <w:abstractNumId w:val="1"/>
+    <w:lvlOverride w:ilvl="0">
+      <w:startOverride w:val="1"/>
+    </w:lvlOverride>
+  </w:num>
+  <w:num w:numId="14">
     <w:abstractNumId w:val="2"/>
     <w:lvlOverride w:ilvl="0">
       <w:startOverride w:val="1"/>

</xml_diff>

<commit_message>
Improve filtering and tilted series geometry
</commit_message>
<xml_diff>
--- a/docs/Шпаргалка для защиты DICOM-проекта.docx
+++ b/docs/Шпаргалка для защиты DICOM-проекта.docx
@@ -750,7 +750,7 @@
         <w:rPr>
           <w:noProof/>
         </w:rPr>
-        <w:t>11</w:t>
+        <w:t>12</w:t>
       </w:r>
       <w:r>
         <w:rPr>
@@ -1304,7 +1304,15 @@
                 <w:bCs/>
                 <w:color w:val="2A7469"/>
               </w:rPr>
-              <w:t>Готовый рассказ. Программа написана на Java 17 с интерфейсом Swing. DICOM (Digital Imaging and Communications in Medicine) — медицинский стандарт файлов изображений и сопутствующих данных; для его чтения используется dcm4che. Каждый загруженный файл представляет срез — двумерное поперечное изображение исследуемой области. Из метаданных, то есть служебных данных DICOM, читаются положение среза, физический шаг пикселя, толщина среза и коэффициенты преобразования. Срезы сортируются по координате Z, затем по Instance Number. Для каждого пикселя вычисляется HU — единица Хаунсфилда, численно характеризующая ослабление рентгеновского излучения тканью на КТ. Далее изображение очищается и ограничивается фильтрами и ручной маской. Обработанные пиксели объединяются в трехмерный объем, очищаются от шума, а его поверхность отображается как облако точек.</w:t>
+              <w:t>Готовый рассказ. Программа написана на Java 17 с интерфейсом Swing. DICOM (Digital Imaging and Communications in Medicine) — медицинский стандарт файлов изображений и сопутствующих данных; для его чтения используется dcm4che. Каждый загруженный файл представляет срез — двумерное изображение исследуемой области. Из метаданных читаются положение и ориентация среза, физический шаг пикселя, толщина среза и коэффициенты преобразования. Положение вдоль серии вычисляется проекцией ImagePositionPatient на нормаль плоскости из ImageOrientationPatient, затем срезы сортируются. Для каждого пикселя вычисляется HU — единица Хаунсфилда, численно характеризующая ослабление рентгеновского излучения тканью на КТ. Далее изображение очищается и ограничивается фильтрами и ручной маской. Обработанные пиксели объединяются в трехмерный объем, очищаются от шума, а его поверхность отображается как облако точек.</w:t>
+            </w:r>
+            <w:r>
+              <w:rPr>
+                <w:b/>
+                <w:bCs/>
+                <w:color w:val="2A7469"/>
+              </w:rPr>
+              <w:t>.</w:t>
             </w:r>
           </w:p>
         </w:tc>
@@ -1367,7 +1375,7 @@
         <w:spacing w:after="90" w:line="270" w:lineRule="auto"/>
       </w:pPr>
       <w:r>
-        <w:t>Изменить порог яркости, HU-диапазон и размытие; объяснить, что слева исходный срез, справа результат.</w:t>
+        <w:t>Переключить медианный фильтр, изменить порог яркости, HU-диапазон и размытие; объяснить, что слева исходный срез, справа результат.</w:t>
       </w:r>
     </w:p>
     <w:p>
@@ -2876,7 +2884,7 @@
         <w:spacing w:after="90" w:line="270" w:lineRule="auto"/>
       </w:pPr>
       <w:r>
-        <w:t>Срезы сортируются по Z, затем по Instance Number, затем по имени файла.</w:t>
+        <w:t>Срезы сортируются по физическому положению вдоль нормали серии, затем по Instance Number и имени файла.</w:t>
       </w:r>
     </w:p>
     <w:p>
@@ -2953,10 +2961,10 @@
                 <w:bCs/>
                 <w:color w:val="2A7469"/>
               </w:rPr>
-              <w:t xml:space="preserve">Почему нельзя сортировать только по имени файла? </w:t>
-            </w:r>
-            <w:r>
-              <w:t>Имя файла не обязано отражать анатомический порядок. Корректнее использовать Image Position Patient по Z, а Instance Number оставить запасным критерием.</w:t>
+              <w:t>Почему нельзя сортировать только по имени файла? Имя файла не обязано отражать анатомический порядок. Корректнее вычислить положение среза по ImagePositionPatient и ImageOrientationPatient, а Instance Number оставить запасным критерием.</w:t>
+            </w:r>
+            <w:r>
+              <w:t>.</w:t>
             </w:r>
           </w:p>
         </w:tc>
@@ -3209,7 +3217,10 @@
               <w:spacing w:line="245" w:lineRule="auto"/>
             </w:pPr>
             <w:r>
-              <w:t>Получение физической координаты Z и сортировка.</w:t>
+              <w:t>Получение физического положения среза; вместе с ImageOrientationPatient используется для сортировки.</w:t>
+            </w:r>
+            <w:r>
+              <w:t>.</w:t>
             </w:r>
           </w:p>
         </w:tc>
@@ -3833,6 +3844,7 @@
               <w:spacing w:line="245" w:lineRule="auto"/>
             </w:pPr>
             <w:r>
+              <w:lastRenderedPageBreak/>
               <w:t>Готовый диапазон HU</w:t>
             </w:r>
           </w:p>
@@ -3941,7 +3953,6 @@
               <w:spacing w:line="245" w:lineRule="auto"/>
             </w:pPr>
             <w:r>
-              <w:lastRenderedPageBreak/>
               <w:t>Построить облако точек</w:t>
             </w:r>
           </w:p>
@@ -4049,10 +4060,10 @@
                 <w:bCs/>
                 <w:color w:val="2A7469"/>
               </w:rPr>
-              <w:t xml:space="preserve">Главный ответ. </w:t>
-            </w:r>
-            <w:r>
-              <w:t>Исходное серое изображение → медианный фильтр 3×3, если размытие больше нуля → box blur с выбранным радиусом → одновременная проверка порога яркости и HU-диапазона → ручная маска.</w:t>
+              <w:t>Главный ответ. Исходное серое изображение → щадящий медианный фильтр 3×3, если установлен отдельный флажок → необязательный box blur с выбранным радиусом → одновременная проверка порога яркости и исходного HU-диапазона → ручная маска.</w:t>
+            </w:r>
+            <w:r>
+              <w:t>.</w:t>
             </w:r>
           </w:p>
         </w:tc>
@@ -4099,10 +4110,7 @@
           <w:b/>
           <w:color w:val="2A7469"/>
         </w:rPr>
-        <w:t xml:space="preserve">Подробнее: </w:t>
-      </w:r>
-      <w:r>
-        <w:t>для каждого положения формируется девятиэлементное ядро 3×3, значения сортируются и выбирается медиана. В отличие от среднего значения медиана почти не реагирует на один очень большой или маленький выброс, поэтому метод подходит для импульсного шума. Ограничение: он не удаляет любой шум вообще и при многократном применении тоже может сглаживать мелкие детали. В проекте он выполняется один раз и только при размытии больше нуля.</w:t>
+        <w:t>Подробнее: медианный фильтр работает только с экранной серой яркостью 0…255. Пиксель заменяется медианой окна 3×3 лишь тогда, когда у него меньше двух соседей с близкой яркостью в пределах 24 уровней. Это щадящий вариант: он подавляет отдельные яркостные выбросы, но сохраняет связанные тонкие границы. Исходный HU-массив фильтр не изменяет.</w:t>
       </w:r>
     </w:p>
     <w:p>
@@ -4125,7 +4133,7 @@
         <w:spacing w:after="120"/>
       </w:pPr>
       <w:r>
-        <w:t>Ядро фильтра — небольшое окно соседних пикселей, значения которых участвуют в вычислении нового значения центрального пикселя. В текущем коде ядро медианного фильтра фиксировано и равно 3×3. Медианный фильтр включается, когда ползунок «Размытие» больше нуля.</w:t>
+        <w:t>Ядро фильтра — небольшое окно соседних пикселей, значения которых участвуют в вычислении нового значения центрального пикселя. В текущем коде ядро медианного фильтра фиксировано и равно 3×3. Он включается отдельным флажком «Медианный фильтр 3×3» и не зависит от значения ползунка размытия.</w:t>
       </w:r>
     </w:p>
     <w:p>
@@ -4154,6 +4162,7 @@
           <w:b/>
           <w:color w:val="2A7469"/>
         </w:rPr>
+        <w:lastRenderedPageBreak/>
         <w:t xml:space="preserve">Простыми словами: </w:t>
       </w:r>
       <w:r>
@@ -4169,7 +4178,6 @@
           <w:b/>
           <w:color w:val="2A7469"/>
         </w:rPr>
-        <w:lastRenderedPageBreak/>
         <w:t xml:space="preserve">Подробнее: </w:t>
       </w:r>
       <w:r>
@@ -4279,10 +4287,7 @@
           <w:b/>
           <w:color w:val="2A7469"/>
         </w:rPr>
-        <w:t xml:space="preserve">Подробнее: </w:t>
-      </w:r>
-      <w:r>
-        <w:t>для каждого пикселя проверяются две границы: HU ≥ minHU и HU ≤ maxHU. Значения вне полосы зануляются. Проверка использует исходный массив huPixels, а не размытое изображение, поэтому физическая оценка ткани не меняется после сглаживания. Это простая сегментация по одному признаку; она не различает разные органы с пересекающимися HU.</w:t>
+        <w:t>Подробнее: для каждого пикселя проверяются две границы: HU ≥ minHU и HU ≤ maxHU. Значения вне полосы зануляются. Проверка всегда использует исходный массив huPixels. Медианный фильтр и box blur изменяют только экранную яркость и никогда не изменяют HU. Это простая сегментация по одному признаку; она не различает разные органы с пересекающимися HU.</w:t>
       </w:r>
     </w:p>
     <w:p>
@@ -4344,7 +4349,11 @@
         <w:t xml:space="preserve">Подробнее: </w:t>
       </w:r>
       <w:r>
-        <w:t>маска имеет тот же размер, что и срез, и хранится отдельно в каждом DicomSlice. При применении выполняется логическое пересечение результата фильтров с маской: пиксель остается только там, где фильтры его сохранили и маска не равна нулю. Кисть и полигон изменяют только маску, поэтому исходные пиксели и HU не теряются.</w:t>
+        <w:t xml:space="preserve">маска имеет тот же размер, что и срез, и хранится отдельно в каждом DicomSlice. При применении выполняется логическое пересечение результата фильтров с маской: пиксель </w:t>
+      </w:r>
+      <w:r>
+        <w:lastRenderedPageBreak/>
+        <w:t>остается только там, где фильтры его сохранили и маска не равна нулю. Кисть и полигон изменяют только маску, поэтому исходные пиксели и HU не теряются.</w:t>
       </w:r>
     </w:p>
     <w:p>
@@ -4359,7 +4368,6 @@
           <w:sz w:val="19"/>
           <w:szCs w:val="19"/>
         </w:rPr>
-        <w:lastRenderedPageBreak/>
         <w:t>если manualMask(x,y) == 0, то processedImage(x,y) = 0</w:t>
       </w:r>
     </w:p>
@@ -4376,7 +4384,7 @@
         <w:spacing w:after="120"/>
       </w:pPr>
       <w:r>
-        <w:t>Сначала подавляется шум и сглаживается яркость, затем выбираются нужные значения. HU-проверка при этом использует исходный HU-массив, поэтому размытие не искажает физическую принадлежность пикселя диапазону тканей. Ручная маска применяется последней как явное пользовательское ограничение.</w:t>
+        <w:t>Сначала при необходимости щадящий медианный фильтр подавляет одиночные выбросы экранной яркости, затем box blur отдельно сглаживает яркость. После этого одновременно проверяются яркостный порог и выбранный диапазон исходных HU. Ручная маска применяется последней как явное пользовательское ограничение.</w:t>
       </w:r>
     </w:p>
     <w:p>
@@ -5740,10 +5748,7 @@
           <w:b/>
           <w:color w:val="2A7469"/>
         </w:rPr>
-        <w:t xml:space="preserve">Подробнее: </w:t>
-      </w:r>
-      <w:r>
-        <w:t>индексы пикселей умножаются на PixelSpacing, а Z берется из ImagePositionPatient; если точной Z-координаты нет, используется SliceThickness. Координаты центрируются вокруг нуля для удобного вращения. Это сохраняет масштаб осей, но проект не применяет полную матрицу ориентации пациента.</w:t>
+        <w:t>Подробнее: индексы пикселей умножаются на PixelSpacing, а положение вдоль серии вычисляется проекцией ImagePositionPatient на нормаль, полученную из ImageOrientationPatient. Это предотвращает сжатие глубины у наклонных серий. Если пространственного положения нет, используется SliceThickness. Координаты центрируются вокруг нуля для удобного вращения. Полный поворот локальных осей X/Y по матрице ориентации пока не применяется.</w:t>
       </w:r>
     </w:p>
     <w:p>
@@ -5792,6 +5797,7 @@
       </w:pPr>
       <w:bookmarkStart w:id="9" w:name="_Toc232233539"/>
       <w:r>
+        <w:lastRenderedPageBreak/>
         <w:t>Отображение облака точек</w:t>
       </w:r>
       <w:bookmarkEnd w:id="9"/>
@@ -5829,7 +5835,6 @@
         <w:spacing w:after="70" w:line="260" w:lineRule="auto"/>
       </w:pPr>
       <w:r>
-        <w:lastRenderedPageBreak/>
         <w:t>Перетаскивание мыши изменяет углы angleX и angleY.</w:t>
       </w:r>
     </w:p>
@@ -6783,6 +6788,7 @@
               <w:spacing w:line="245" w:lineRule="auto"/>
             </w:pPr>
             <w:r>
+              <w:lastRenderedPageBreak/>
               <w:t>Запуск трехмерки</w:t>
             </w:r>
           </w:p>
@@ -6999,7 +7005,6 @@
               <w:spacing w:line="245" w:lineRule="auto"/>
             </w:pPr>
             <w:r>
-              <w:lastRenderedPageBreak/>
               <w:t>Выделение поверхности</w:t>
             </w:r>
           </w:p>
@@ -7811,10 +7816,8 @@
           <w:b/>
           <w:bCs/>
         </w:rPr>
-        <w:t xml:space="preserve">Ответ: </w:t>
-      </w:r>
-      <w:r>
-        <w:t>Медианный фильтр и box blur при размытии больше нуля, затем совместная проверка яркости и HU-диапазона, после этого ручная маска.</w:t>
+        <w:lastRenderedPageBreak/>
+        <w:t>Ответ: Сначала отдельно включаемый щадящий медианный фильтр обрабатывает экранную яркость, затем при ненулевом радиусе box blur сглаживает яркость. После этого совместно проверяются порог яркости и исходный HU-диапазон, а последней применяется ручная маска.</w:t>
       </w:r>
     </w:p>
     <w:p>
@@ -7862,6 +7865,806 @@
           <w:bCs/>
           <w:color w:val="2A7469"/>
         </w:rPr>
+        <w:t xml:space="preserve">Вопрос: </w:t>
+      </w:r>
+      <w:r>
+        <w:rPr>
+          <w:b/>
+          <w:bCs/>
+        </w:rPr>
+        <w:t>Откуда берутся Slope и Intercept?</w:t>
+      </w:r>
+    </w:p>
+    <w:p>
+      <w:pPr>
+        <w:spacing w:after="170"/>
+      </w:pPr>
+      <w:r>
+        <w:rPr>
+          <w:b/>
+          <w:bCs/>
+        </w:rPr>
+        <w:t xml:space="preserve">Ответ: </w:t>
+      </w:r>
+      <w:r>
+        <w:t>Из метаданных каждого DICOM-файла.</w:t>
+      </w:r>
+    </w:p>
+    <w:p>
+      <w:pPr>
+        <w:spacing w:after="120"/>
+      </w:pPr>
+      <w:r>
+        <w:rPr>
+          <w:b/>
+          <w:bCs/>
+          <w:color w:val="2A7469"/>
+        </w:rPr>
+        <w:t xml:space="preserve">Вопрос: </w:t>
+      </w:r>
+      <w:r>
+        <w:rPr>
+          <w:b/>
+          <w:bCs/>
+        </w:rPr>
+        <w:t>Почему HU и яркость — не одно и то же?</w:t>
+      </w:r>
+    </w:p>
+    <w:p>
+      <w:pPr>
+        <w:spacing w:after="170"/>
+      </w:pPr>
+      <w:r>
+        <w:rPr>
+          <w:b/>
+          <w:bCs/>
+        </w:rPr>
+        <w:t xml:space="preserve">Ответ: </w:t>
+      </w:r>
+      <w:r>
+        <w:t>HU отражает исходную плотность, а яркость 0…255 получается после оконного преобразования только для отображения.</w:t>
+      </w:r>
+    </w:p>
+    <w:p>
+      <w:pPr>
+        <w:spacing w:after="120"/>
+      </w:pPr>
+      <w:r>
+        <w:rPr>
+          <w:b/>
+          <w:bCs/>
+          <w:color w:val="2A7469"/>
+        </w:rPr>
+        <w:t xml:space="preserve">Вопрос: </w:t>
+      </w:r>
+      <w:r>
+        <w:rPr>
+          <w:b/>
+          <w:bCs/>
+        </w:rPr>
+        <w:t>Что такое полосовой фильтр?</w:t>
+      </w:r>
+    </w:p>
+    <w:p>
+      <w:pPr>
+        <w:spacing w:after="170"/>
+      </w:pPr>
+      <w:r>
+        <w:rPr>
+          <w:b/>
+          <w:bCs/>
+        </w:rPr>
+        <w:t xml:space="preserve">Ответ: </w:t>
+      </w:r>
+      <w:r>
+        <w:t>Двойной порог: сохраняются значения между minHU и maxHU, все значения снаружи диапазона зануляются.</w:t>
+      </w:r>
+    </w:p>
+    <w:p>
+      <w:pPr>
+        <w:spacing w:after="120"/>
+      </w:pPr>
+      <w:r>
+        <w:rPr>
+          <w:b/>
+          <w:bCs/>
+          <w:color w:val="2A7469"/>
+        </w:rPr>
+        <w:t xml:space="preserve">Вопрос: </w:t>
+      </w:r>
+      <w:r>
+        <w:rPr>
+          <w:b/>
+          <w:bCs/>
+        </w:rPr>
+        <w:t>Как работает медианный фильтр?</w:t>
+      </w:r>
+    </w:p>
+    <w:p>
+      <w:pPr>
+        <w:spacing w:after="170"/>
+      </w:pPr>
+      <w:r>
+        <w:rPr>
+          <w:b/>
+          <w:bCs/>
+        </w:rPr>
+        <w:t>Ответ: Берется окно 3×3, девять значений сортируются и выбирается медиана. Яркость заменяется медианой только у практически одиночного выброса, имеющего меньше двух похожих соседей. HU-массив фильтр не изменяет, поэтому костный диапазон не теряет тонкие участки.</w:t>
+      </w:r>
+    </w:p>
+    <w:p>
+      <w:pPr>
+        <w:spacing w:after="120"/>
+      </w:pPr>
+      <w:r>
+        <w:rPr>
+          <w:b/>
+          <w:bCs/>
+          <w:color w:val="2A7469"/>
+        </w:rPr>
+        <w:t xml:space="preserve">Вопрос: </w:t>
+      </w:r>
+      <w:r>
+        <w:rPr>
+          <w:b/>
+          <w:bCs/>
+        </w:rPr>
+        <w:t>Что такое kernel size?</w:t>
+      </w:r>
+    </w:p>
+    <w:p>
+      <w:pPr>
+        <w:spacing w:after="170"/>
+      </w:pPr>
+      <w:r>
+        <w:rPr>
+          <w:b/>
+          <w:bCs/>
+        </w:rPr>
+        <w:t xml:space="preserve">Ответ: </w:t>
+      </w:r>
+      <w:r>
+        <w:t>Размер ядра фильтра. Для медианного фильтра он фиксирован 3×3. Для box blur размер равен 2r+1, где r задается ползунком.</w:t>
+      </w:r>
+    </w:p>
+    <w:p>
+      <w:pPr>
+        <w:spacing w:after="120"/>
+      </w:pPr>
+      <w:r>
+        <w:rPr>
+          <w:b/>
+          <w:bCs/>
+          <w:color w:val="2A7469"/>
+        </w:rPr>
+        <w:t xml:space="preserve">Вопрос: </w:t>
+      </w:r>
+      <w:r>
+        <w:rPr>
+          <w:b/>
+          <w:bCs/>
+        </w:rPr>
+        <w:t>Почему box blur, а не Gaussian blur?</w:t>
+      </w:r>
+    </w:p>
+    <w:p>
+      <w:pPr>
+        <w:spacing w:after="170"/>
+      </w:pPr>
+      <w:r>
+        <w:rPr>
+          <w:b/>
+          <w:bCs/>
+        </w:rPr>
+        <w:t xml:space="preserve">Ответ: </w:t>
+      </w:r>
+      <w:r>
+        <w:t>Box blur проще и быстрее. В реализации два одномерных прохода со скользящей суммой, поэтому он подходит для интерактивного просмотра.</w:t>
+      </w:r>
+    </w:p>
+    <w:p>
+      <w:pPr>
+        <w:spacing w:after="120"/>
+      </w:pPr>
+      <w:r>
+        <w:rPr>
+          <w:b/>
+          <w:bCs/>
+          <w:color w:val="2A7469"/>
+        </w:rPr>
+        <w:t xml:space="preserve">Вопрос: </w:t>
+      </w:r>
+      <w:r>
+        <w:rPr>
+          <w:b/>
+          <w:bCs/>
+        </w:rPr>
+        <w:t>Как определяется порядок изображений?</w:t>
+      </w:r>
+    </w:p>
+    <w:p>
+      <w:pPr>
+        <w:spacing w:after="170"/>
+      </w:pPr>
+      <w:r>
+        <w:rPr>
+          <w:b/>
+          <w:bCs/>
+        </w:rPr>
+        <w:t>Ответ: Сначала по физическому положению вдоль нормали серии, вычисленному из ImagePositionPatient и ImageOrientationPatient, затем по InstanceNumber и имени файла.</w:t>
+      </w:r>
+    </w:p>
+    <w:p>
+      <w:pPr>
+        <w:spacing w:after="120"/>
+      </w:pPr>
+      <w:r>
+        <w:rPr>
+          <w:b/>
+          <w:bCs/>
+          <w:color w:val="2A7469"/>
+        </w:rPr>
+        <w:t xml:space="preserve">Вопрос: </w:t>
+      </w:r>
+      <w:r>
+        <w:rPr>
+          <w:b/>
+          <w:bCs/>
+        </w:rPr>
+        <w:t>Что такое один срез в коде?</w:t>
+      </w:r>
+    </w:p>
+    <w:p>
+      <w:pPr>
+        <w:spacing w:after="170"/>
+      </w:pPr>
+      <w:r>
+        <w:rPr>
+          <w:b/>
+          <w:bCs/>
+        </w:rPr>
+        <w:t xml:space="preserve">Ответ: </w:t>
+      </w:r>
+      <w:r>
+        <w:t>Объект DicomSlice, содержащий изображения, HU-массив, маску и пространственные метаданные.</w:t>
+      </w:r>
+    </w:p>
+    <w:p>
+      <w:pPr>
+        <w:spacing w:after="120"/>
+      </w:pPr>
+      <w:r>
+        <w:rPr>
+          <w:b/>
+          <w:bCs/>
+          <w:color w:val="2A7469"/>
+        </w:rPr>
+        <w:t xml:space="preserve">Вопрос: </w:t>
+      </w:r>
+      <w:r>
+        <w:rPr>
+          <w:b/>
+          <w:bCs/>
+        </w:rPr>
+        <w:t>Как данные пикселей хранятся в программе?</w:t>
+      </w:r>
+    </w:p>
+    <w:p>
+      <w:pPr>
+        <w:spacing w:after="170"/>
+      </w:pPr>
+      <w:r>
+        <w:rPr>
+          <w:b/>
+          <w:bCs/>
+        </w:rPr>
+        <w:t xml:space="preserve">Ответ: </w:t>
+      </w:r>
+      <w:r>
+        <w:t>HU хранятся в одномерном float-массиве. Индекс пикселя равен row × width + col. Изображения хранятся как BufferedImage.</w:t>
+      </w:r>
+    </w:p>
+    <w:p>
+      <w:pPr>
+        <w:spacing w:after="120"/>
+      </w:pPr>
+      <w:r>
+        <w:rPr>
+          <w:b/>
+          <w:bCs/>
+          <w:color w:val="2A7469"/>
+        </w:rPr>
+        <w:t xml:space="preserve">Вопрос: </w:t>
+      </w:r>
+      <w:r>
+        <w:rPr>
+          <w:b/>
+          <w:bCs/>
+        </w:rPr>
+        <w:t>Зачем две картинки в центре?</w:t>
+      </w:r>
+    </w:p>
+    <w:p>
+      <w:pPr>
+        <w:spacing w:after="170"/>
+      </w:pPr>
+      <w:r>
+        <w:rPr>
+          <w:b/>
+          <w:bCs/>
+        </w:rPr>
+        <w:t xml:space="preserve">Ответ: </w:t>
+      </w:r>
+      <w:r>
+        <w:t>Слева неизменный originalImage, справа processedImage. Так можно сравнить результат фильтрации с исходником.</w:t>
+      </w:r>
+    </w:p>
+    <w:p>
+      <w:pPr>
+        <w:spacing w:after="120"/>
+      </w:pPr>
+      <w:r>
+        <w:rPr>
+          <w:b/>
+          <w:bCs/>
+          <w:color w:val="2A7469"/>
+        </w:rPr>
+        <w:t xml:space="preserve">Вопрос: </w:t>
+      </w:r>
+      <w:r>
+        <w:rPr>
+          <w:b/>
+          <w:bCs/>
+        </w:rPr>
+        <w:t>Фильтры применяются ко всем срезам?</w:t>
+      </w:r>
+    </w:p>
+    <w:p>
+      <w:pPr>
+        <w:spacing w:after="170"/>
+      </w:pPr>
+      <w:r>
+        <w:rPr>
+          <w:b/>
+          <w:bCs/>
+        </w:rPr>
+        <w:lastRenderedPageBreak/>
+        <w:t xml:space="preserve">Ответ: </w:t>
+      </w:r>
+      <w:r>
+        <w:t>Изменение ползунков сразу пересчитывает текущий срез. Кнопка «Применить к диапазону» обрабатывает выбранный диапазон. Перед 3D выбранный диапазон также пересчитывается.</w:t>
+      </w:r>
+    </w:p>
+    <w:p>
+      <w:pPr>
+        <w:spacing w:after="120"/>
+      </w:pPr>
+      <w:r>
+        <w:rPr>
+          <w:b/>
+          <w:bCs/>
+          <w:color w:val="2A7469"/>
+        </w:rPr>
+        <w:t xml:space="preserve">Вопрос: </w:t>
+      </w:r>
+      <w:r>
+        <w:rPr>
+          <w:b/>
+          <w:bCs/>
+        </w:rPr>
+        <w:t>Как работает ручная маска?</w:t>
+      </w:r>
+    </w:p>
+    <w:p>
+      <w:pPr>
+        <w:spacing w:after="170"/>
+      </w:pPr>
+      <w:r>
+        <w:rPr>
+          <w:b/>
+          <w:bCs/>
+        </w:rPr>
+        <w:t xml:space="preserve">Ответ: </w:t>
+      </w:r>
+      <w:r>
+        <w:t>Это отдельное черно-белое изображение. Белое оставляет пиксель, черное зануляет его после автоматических фильтров.</w:t>
+      </w:r>
+    </w:p>
+    <w:p>
+      <w:pPr>
+        <w:spacing w:after="120"/>
+      </w:pPr>
+      <w:r>
+        <w:rPr>
+          <w:b/>
+          <w:bCs/>
+          <w:color w:val="2A7469"/>
+        </w:rPr>
+        <w:t xml:space="preserve">Вопрос: </w:t>
+      </w:r>
+      <w:r>
+        <w:rPr>
+          <w:b/>
+          <w:bCs/>
+        </w:rPr>
+        <w:t>Маска меняет исходный DICOM?</w:t>
+      </w:r>
+    </w:p>
+    <w:p>
+      <w:pPr>
+        <w:spacing w:after="170"/>
+      </w:pPr>
+      <w:r>
+        <w:rPr>
+          <w:b/>
+          <w:bCs/>
+        </w:rPr>
+        <w:t xml:space="preserve">Ответ: </w:t>
+      </w:r>
+      <w:r>
+        <w:t>Нет. OriginalImage и HU-массив остаются неизменными. Меняется только manualMask и processedImage.</w:t>
+      </w:r>
+    </w:p>
+    <w:p>
+      <w:pPr>
+        <w:spacing w:after="120"/>
+      </w:pPr>
+      <w:r>
+        <w:rPr>
+          <w:b/>
+          <w:bCs/>
+          <w:color w:val="2A7469"/>
+        </w:rPr>
+        <w:t xml:space="preserve">Вопрос: </w:t>
+      </w:r>
+      <w:r>
+        <w:rPr>
+          <w:b/>
+          <w:bCs/>
+        </w:rPr>
+        <w:t>Что такое шаг выборки?</w:t>
+      </w:r>
+    </w:p>
+    <w:p>
+      <w:pPr>
+        <w:spacing w:after="170"/>
+      </w:pPr>
+      <w:r>
+        <w:rPr>
+          <w:b/>
+          <w:bCs/>
+        </w:rPr>
+        <w:t xml:space="preserve">Ответ: </w:t>
+      </w:r>
+      <w:r>
+        <w:t>Через сколько пикселей брать данные по X/Y. Чем меньше шаг, тем больше деталей и нагрузка. По Z используется max(1, step/2).</w:t>
+      </w:r>
+    </w:p>
+    <w:p>
+      <w:pPr>
+        <w:spacing w:after="120"/>
+      </w:pPr>
+      <w:r>
+        <w:rPr>
+          <w:b/>
+          <w:bCs/>
+          <w:color w:val="2A7469"/>
+        </w:rPr>
+        <w:t xml:space="preserve">Вопрос: </w:t>
+      </w:r>
+      <w:r>
+        <w:rPr>
+          <w:b/>
+          <w:bCs/>
+        </w:rPr>
+        <w:t>Как строится трехмерка?</w:t>
+      </w:r>
+    </w:p>
+    <w:p>
+      <w:pPr>
+        <w:spacing w:after="170"/>
+      </w:pPr>
+      <w:r>
+        <w:rPr>
+          <w:b/>
+          <w:bCs/>
+        </w:rPr>
+        <w:t xml:space="preserve">Ответ: </w:t>
+      </w:r>
+      <w:r>
+        <w:t>Обработанные ненулевые пиксели превращаются в активные воксели, очищаются от шума, затем берутся поверхностные воксели и переводятся в физические координаты.</w:t>
+      </w:r>
+    </w:p>
+    <w:p>
+      <w:pPr>
+        <w:spacing w:after="120"/>
+      </w:pPr>
+      <w:r>
+        <w:rPr>
+          <w:b/>
+          <w:bCs/>
+          <w:color w:val="2A7469"/>
+        </w:rPr>
+        <w:t xml:space="preserve">Вопрос: </w:t>
+      </w:r>
+      <w:r>
+        <w:rPr>
+          <w:b/>
+          <w:bCs/>
+        </w:rPr>
+        <w:t>Это полноценная 3D-модель?</w:t>
+      </w:r>
+    </w:p>
+    <w:p>
+      <w:pPr>
+        <w:spacing w:after="170"/>
+      </w:pPr>
+      <w:r>
+        <w:rPr>
+          <w:b/>
+          <w:bCs/>
+        </w:rPr>
+        <w:t xml:space="preserve">Ответ: </w:t>
+      </w:r>
+      <w:r>
+        <w:t>Нет, это трехмерное облако поверхностных точек без треугольных граней.</w:t>
+      </w:r>
+    </w:p>
+    <w:p>
+      <w:pPr>
+        <w:spacing w:after="120"/>
+      </w:pPr>
+      <w:r>
+        <w:rPr>
+          <w:b/>
+          <w:bCs/>
+          <w:color w:val="2A7469"/>
+        </w:rPr>
+        <w:t xml:space="preserve">Вопрос: </w:t>
+      </w:r>
+      <w:r>
+        <w:rPr>
+          <w:b/>
+          <w:bCs/>
+        </w:rPr>
+        <w:t>Почему не берутся все активные воксели?</w:t>
+      </w:r>
+    </w:p>
+    <w:p>
+      <w:pPr>
+        <w:spacing w:after="170"/>
+      </w:pPr>
+      <w:r>
+        <w:rPr>
+          <w:b/>
+          <w:bCs/>
+        </w:rPr>
+        <w:t xml:space="preserve">Ответ: </w:t>
+      </w:r>
+      <w:r>
+        <w:t>Внутренние точки не видны и создают лишнюю нагрузку. Поэтому сохраняется только поверхность.</w:t>
+      </w:r>
+    </w:p>
+    <w:p>
+      <w:pPr>
+        <w:spacing w:after="120"/>
+      </w:pPr>
+      <w:r>
+        <w:rPr>
+          <w:b/>
+          <w:bCs/>
+          <w:color w:val="2A7469"/>
+        </w:rPr>
+        <w:t xml:space="preserve">Вопрос: </w:t>
+      </w:r>
+      <w:r>
+        <w:rPr>
+          <w:b/>
+          <w:bCs/>
+        </w:rPr>
+        <w:t>Как определяется поверхностный воксель?</w:t>
+      </w:r>
+    </w:p>
+    <w:p>
+      <w:pPr>
+        <w:spacing w:after="170"/>
+      </w:pPr>
+      <w:r>
+        <w:rPr>
+          <w:b/>
+          <w:bCs/>
+        </w:rPr>
+        <w:t xml:space="preserve">Ответ: </w:t>
+      </w:r>
+      <w:r>
+        <w:t>Если хотя бы один из шести соседей по X, Y или Z отсутствует, воксель считается поверхностным.</w:t>
+      </w:r>
+    </w:p>
+    <w:p>
+      <w:pPr>
+        <w:spacing w:after="120"/>
+      </w:pPr>
+      <w:r>
+        <w:rPr>
+          <w:b/>
+          <w:bCs/>
+          <w:color w:val="2A7469"/>
+        </w:rPr>
+        <w:t xml:space="preserve">Вопрос: </w:t>
+      </w:r>
+      <w:r>
+        <w:rPr>
+          <w:b/>
+          <w:bCs/>
+        </w:rPr>
+        <w:t>Как удаляется шум в 3D?</w:t>
+      </w:r>
+    </w:p>
+    <w:p>
+      <w:pPr>
+        <w:spacing w:after="170"/>
+      </w:pPr>
+      <w:r>
+        <w:rPr>
+          <w:b/>
+          <w:bCs/>
+        </w:rPr>
+        <w:t xml:space="preserve">Ответ: </w:t>
+      </w:r>
+      <w:r>
+        <w:t>Удаляются воксели менее чем с двумя соседями в 26-окрестности, затем связанные компоненты меньше 64 вокселей.</w:t>
+      </w:r>
+    </w:p>
+    <w:p>
+      <w:pPr>
+        <w:spacing w:after="120"/>
+      </w:pPr>
+      <w:r>
+        <w:rPr>
+          <w:b/>
+          <w:bCs/>
+          <w:color w:val="2A7469"/>
+        </w:rPr>
+        <w:t xml:space="preserve">Вопрос: </w:t>
+      </w:r>
+      <w:r>
+        <w:rPr>
+          <w:b/>
+          <w:bCs/>
+        </w:rPr>
+        <w:t>Почему не оставляется только крупнейшая 3D-компонента?</w:t>
+      </w:r>
+    </w:p>
+    <w:p>
+      <w:pPr>
+        <w:spacing w:after="170"/>
+      </w:pPr>
+      <w:r>
+        <w:rPr>
+          <w:b/>
+          <w:bCs/>
+        </w:rPr>
+        <w:t xml:space="preserve">Ответ: </w:t>
+      </w:r>
+      <w:r>
+        <w:t>Кости и другие нужные структуры могут быть отдельными. Поэтому сохраняются все компоненты достаточного размера.</w:t>
+      </w:r>
+    </w:p>
+    <w:p>
+      <w:pPr>
+        <w:spacing w:after="120"/>
+      </w:pPr>
+      <w:r>
+        <w:rPr>
+          <w:b/>
+          <w:bCs/>
+          <w:color w:val="2A7469"/>
+        </w:rPr>
+        <w:t xml:space="preserve">Вопрос: </w:t>
+      </w:r>
+      <w:r>
+        <w:rPr>
+          <w:b/>
+          <w:bCs/>
+        </w:rPr>
+        <w:t>Как убирается стол томографа?</w:t>
+      </w:r>
+    </w:p>
+    <w:p>
+      <w:pPr>
+        <w:spacing w:after="170"/>
+      </w:pPr>
+      <w:r>
+        <w:rPr>
+          <w:b/>
+          <w:bCs/>
+        </w:rPr>
+        <w:t xml:space="preserve">Ответ: </w:t>
+      </w:r>
+      <w:r>
+        <w:t>На каждом срезе строится маска пикселей выше −350 HU и оставляется крупнейшая связная область тела.</w:t>
+      </w:r>
+    </w:p>
+    <w:p>
+      <w:pPr>
+        <w:spacing w:after="120"/>
+      </w:pPr>
+      <w:r>
+        <w:rPr>
+          <w:b/>
+          <w:bCs/>
+          <w:color w:val="2A7469"/>
+        </w:rPr>
+        <w:t xml:space="preserve">Вопрос: </w:t>
+      </w:r>
+      <w:r>
+        <w:rPr>
+          <w:b/>
+          <w:bCs/>
+        </w:rPr>
+        <w:t>Почему пропорции 3D не искажены?</w:t>
+      </w:r>
+    </w:p>
+    <w:p>
+      <w:pPr>
+        <w:spacing w:after="170"/>
+      </w:pPr>
+      <w:r>
+        <w:rPr>
+          <w:b/>
+          <w:bCs/>
+        </w:rPr>
+        <w:t xml:space="preserve">Ответ: </w:t>
+      </w:r>
+      <w:r>
+        <w:t>Координаты рассчитываются с учетом PixelSpacing, положения среза по Z и SliceThickness как запасного варианта.</w:t>
+      </w:r>
+    </w:p>
+    <w:p>
+      <w:pPr>
+        <w:spacing w:after="120"/>
+      </w:pPr>
+      <w:r>
+        <w:rPr>
+          <w:b/>
+          <w:bCs/>
+          <w:color w:val="2A7469"/>
+        </w:rPr>
+        <w:t xml:space="preserve">Вопрос: </w:t>
+      </w:r>
+      <w:r>
+        <w:rPr>
+          <w:b/>
+          <w:bCs/>
+        </w:rPr>
+        <w:t>Зачем ограничение 260 тысяч точек?</w:t>
+      </w:r>
+    </w:p>
+    <w:p>
+      <w:pPr>
+        <w:spacing w:after="170"/>
+      </w:pPr>
+      <w:r>
+        <w:rPr>
+          <w:b/>
+          <w:bCs/>
+        </w:rPr>
+        <w:t xml:space="preserve">Ответ: </w:t>
+      </w:r>
+      <w:r>
+        <w:t>Чтобы отрисовка Java2D оставалась интерактивной. При превышении точки равномерно прореживаются.</w:t>
+      </w:r>
+    </w:p>
+    <w:p>
+      <w:pPr>
+        <w:spacing w:after="120"/>
+      </w:pPr>
+      <w:r>
+        <w:rPr>
+          <w:b/>
+          <w:bCs/>
+          <w:color w:val="2A7469"/>
+        </w:rPr>
         <w:lastRenderedPageBreak/>
         <w:t xml:space="preserve">Вопрос: </w:t>
       </w:r>
@@ -7870,7 +8673,7 @@
           <w:b/>
           <w:bCs/>
         </w:rPr>
-        <w:t>Откуда берутся Slope и Intercept?</w:t>
+        <w:t>Почему органы выглядят общей массой?</w:t>
       </w:r>
     </w:p>
     <w:p>
@@ -7885,7 +8688,7 @@
         <w:t xml:space="preserve">Ответ: </w:t>
       </w:r>
       <w:r>
-        <w:t>Из метаданных каждого DICOM-файла.</w:t>
+        <w:t>Простой HU-диапазон выделяет ткани похожей плотности, но не знает анатомических границ конкретного органа. Для точной сегментации нужны более сложные методы.</w:t>
       </w:r>
     </w:p>
     <w:p>
@@ -7905,7 +8708,7 @@
           <w:b/>
           <w:bCs/>
         </w:rPr>
-        <w:t>Почему HU и яркость — не одно и то же?</w:t>
+        <w:t>Почему некоторые части кости могут пропасть?</w:t>
       </w:r>
     </w:p>
     <w:p>
@@ -7917,10 +8720,7 @@
           <w:b/>
           <w:bCs/>
         </w:rPr>
-        <w:t xml:space="preserve">Ответ: </w:t>
-      </w:r>
-      <w:r>
-        <w:t>HU отражает исходную плотность, а яркость 0…255 получается после оконного преобразования только для отображения.</w:t>
+        <w:t>Ответ: Участок может иметь HU ниже выбранного минимума, быть тоньше шага выборки или удалиться как слишком маленькая компонента. Передние окончания рёбер соединяются с грудиной рёберными хрящами, плотность которых значительно ниже плотности кости, поэтому в костном пресете они закономерно выглядят прерывистыми. Простое снижение minHU добавляет большое количество мягких тканей и шума, поэтому не всегда улучшает результат.</w:t>
       </w:r>
     </w:p>
     <w:p>
@@ -7940,7 +8740,7 @@
           <w:b/>
           <w:bCs/>
         </w:rPr>
-        <w:t>Что такое полосовой фильтр?</w:t>
+        <w:t>Почему программа использует SwingWorker?</w:t>
       </w:r>
     </w:p>
     <w:p>
@@ -7952,813 +8752,6 @@
           <w:b/>
           <w:bCs/>
         </w:rPr>
-        <w:t xml:space="preserve">Ответ: </w:t>
-      </w:r>
-      <w:r>
-        <w:t>Двойной порог: сохраняются значения между minHU и maxHU, все значения снаружи диапазона зануляются.</w:t>
-      </w:r>
-    </w:p>
-    <w:p>
-      <w:pPr>
-        <w:spacing w:after="120"/>
-      </w:pPr>
-      <w:r>
-        <w:rPr>
-          <w:b/>
-          <w:bCs/>
-          <w:color w:val="2A7469"/>
-        </w:rPr>
-        <w:t xml:space="preserve">Вопрос: </w:t>
-      </w:r>
-      <w:r>
-        <w:rPr>
-          <w:b/>
-          <w:bCs/>
-        </w:rPr>
-        <w:t>Как работает медианный фильтр?</w:t>
-      </w:r>
-    </w:p>
-    <w:p>
-      <w:pPr>
-        <w:spacing w:after="170"/>
-      </w:pPr>
-      <w:r>
-        <w:rPr>
-          <w:b/>
-          <w:bCs/>
-        </w:rPr>
-        <w:t xml:space="preserve">Ответ: </w:t>
-      </w:r>
-      <w:r>
-        <w:t>Берется окно 3×3, значения сортируются, выбирается медиана. Он хорошо убирает одиночный импульсный шум.</w:t>
-      </w:r>
-    </w:p>
-    <w:p>
-      <w:pPr>
-        <w:spacing w:after="120"/>
-      </w:pPr>
-      <w:r>
-        <w:rPr>
-          <w:b/>
-          <w:bCs/>
-          <w:color w:val="2A7469"/>
-        </w:rPr>
-        <w:t xml:space="preserve">Вопрос: </w:t>
-      </w:r>
-      <w:r>
-        <w:rPr>
-          <w:b/>
-          <w:bCs/>
-        </w:rPr>
-        <w:t>Что такое kernel size?</w:t>
-      </w:r>
-    </w:p>
-    <w:p>
-      <w:pPr>
-        <w:spacing w:after="170"/>
-      </w:pPr>
-      <w:r>
-        <w:rPr>
-          <w:b/>
-          <w:bCs/>
-        </w:rPr>
-        <w:t xml:space="preserve">Ответ: </w:t>
-      </w:r>
-      <w:r>
-        <w:t>Размер ядра фильтра. Для медианного фильтра он фиксирован 3×3. Для box blur размер равен 2r+1, где r задается ползунком.</w:t>
-      </w:r>
-    </w:p>
-    <w:p>
-      <w:pPr>
-        <w:spacing w:after="120"/>
-      </w:pPr>
-      <w:r>
-        <w:rPr>
-          <w:b/>
-          <w:bCs/>
-          <w:color w:val="2A7469"/>
-        </w:rPr>
-        <w:t xml:space="preserve">Вопрос: </w:t>
-      </w:r>
-      <w:r>
-        <w:rPr>
-          <w:b/>
-          <w:bCs/>
-        </w:rPr>
-        <w:t>Почему box blur, а не Gaussian blur?</w:t>
-      </w:r>
-    </w:p>
-    <w:p>
-      <w:pPr>
-        <w:spacing w:after="170"/>
-      </w:pPr>
-      <w:r>
-        <w:rPr>
-          <w:b/>
-          <w:bCs/>
-        </w:rPr>
-        <w:t xml:space="preserve">Ответ: </w:t>
-      </w:r>
-      <w:r>
-        <w:t>Box blur проще и быстрее. В реализации два одномерных прохода со скользящей суммой, поэтому он подходит для интерактивного просмотра.</w:t>
-      </w:r>
-    </w:p>
-    <w:p>
-      <w:pPr>
-        <w:spacing w:after="120"/>
-      </w:pPr>
-      <w:r>
-        <w:rPr>
-          <w:b/>
-          <w:bCs/>
-          <w:color w:val="2A7469"/>
-        </w:rPr>
-        <w:t xml:space="preserve">Вопрос: </w:t>
-      </w:r>
-      <w:r>
-        <w:rPr>
-          <w:b/>
-          <w:bCs/>
-        </w:rPr>
-        <w:t>Как определяется порядок изображений?</w:t>
-      </w:r>
-    </w:p>
-    <w:p>
-      <w:pPr>
-        <w:spacing w:after="170"/>
-      </w:pPr>
-      <w:r>
-        <w:rPr>
-          <w:b/>
-          <w:bCs/>
-        </w:rPr>
-        <w:t xml:space="preserve">Ответ: </w:t>
-      </w:r>
-      <w:r>
-        <w:t>Сначала по координате Z из ImagePositionPatient, затем по InstanceNumber и имени файла.</w:t>
-      </w:r>
-    </w:p>
-    <w:p>
-      <w:pPr>
-        <w:spacing w:after="120"/>
-      </w:pPr>
-      <w:r>
-        <w:rPr>
-          <w:b/>
-          <w:bCs/>
-          <w:color w:val="2A7469"/>
-        </w:rPr>
-        <w:t xml:space="preserve">Вопрос: </w:t>
-      </w:r>
-      <w:r>
-        <w:rPr>
-          <w:b/>
-          <w:bCs/>
-        </w:rPr>
-        <w:t>Что такое один срез в коде?</w:t>
-      </w:r>
-    </w:p>
-    <w:p>
-      <w:pPr>
-        <w:spacing w:after="170"/>
-      </w:pPr>
-      <w:r>
-        <w:rPr>
-          <w:b/>
-          <w:bCs/>
-        </w:rPr>
-        <w:t xml:space="preserve">Ответ: </w:t>
-      </w:r>
-      <w:r>
-        <w:t>Объект DicomSlice, содержащий изображения, HU-массив, маску и пространственные метаданные.</w:t>
-      </w:r>
-    </w:p>
-    <w:p>
-      <w:pPr>
-        <w:spacing w:after="120"/>
-      </w:pPr>
-      <w:r>
-        <w:rPr>
-          <w:b/>
-          <w:bCs/>
-          <w:color w:val="2A7469"/>
-        </w:rPr>
-        <w:t xml:space="preserve">Вопрос: </w:t>
-      </w:r>
-      <w:r>
-        <w:rPr>
-          <w:b/>
-          <w:bCs/>
-        </w:rPr>
-        <w:t>Как данные пикселей хранятся в программе?</w:t>
-      </w:r>
-    </w:p>
-    <w:p>
-      <w:pPr>
-        <w:spacing w:after="170"/>
-      </w:pPr>
-      <w:r>
-        <w:rPr>
-          <w:b/>
-          <w:bCs/>
-        </w:rPr>
-        <w:t xml:space="preserve">Ответ: </w:t>
-      </w:r>
-      <w:r>
-        <w:t>HU хранятся в одномерном float-массиве. Индекс пикселя равен row × width + col. Изображения хранятся как BufferedImage.</w:t>
-      </w:r>
-    </w:p>
-    <w:p>
-      <w:pPr>
-        <w:spacing w:after="120"/>
-      </w:pPr>
-      <w:r>
-        <w:rPr>
-          <w:b/>
-          <w:bCs/>
-          <w:color w:val="2A7469"/>
-        </w:rPr>
-        <w:t xml:space="preserve">Вопрос: </w:t>
-      </w:r>
-      <w:r>
-        <w:rPr>
-          <w:b/>
-          <w:bCs/>
-        </w:rPr>
-        <w:t>Зачем две картинки в центре?</w:t>
-      </w:r>
-    </w:p>
-    <w:p>
-      <w:pPr>
-        <w:spacing w:after="170"/>
-      </w:pPr>
-      <w:r>
-        <w:rPr>
-          <w:b/>
-          <w:bCs/>
-        </w:rPr>
-        <w:t xml:space="preserve">Ответ: </w:t>
-      </w:r>
-      <w:r>
-        <w:t>Слева неизменный originalImage, справа processedImage. Так можно сравнить результат фильтрации с исходником.</w:t>
-      </w:r>
-    </w:p>
-    <w:p>
-      <w:pPr>
-        <w:spacing w:after="120"/>
-      </w:pPr>
-      <w:r>
-        <w:rPr>
-          <w:b/>
-          <w:bCs/>
-          <w:color w:val="2A7469"/>
-        </w:rPr>
-        <w:t xml:space="preserve">Вопрос: </w:t>
-      </w:r>
-      <w:r>
-        <w:rPr>
-          <w:b/>
-          <w:bCs/>
-        </w:rPr>
-        <w:t>Фильтры применяются ко всем срезам?</w:t>
-      </w:r>
-    </w:p>
-    <w:p>
-      <w:pPr>
-        <w:spacing w:after="170"/>
-      </w:pPr>
-      <w:r>
-        <w:rPr>
-          <w:b/>
-          <w:bCs/>
-        </w:rPr>
-        <w:t xml:space="preserve">Ответ: </w:t>
-      </w:r>
-      <w:r>
-        <w:t>Изменение ползунков сразу пересчитывает текущий срез. Кнопка «Применить к диапазону» обрабатывает выбранный диапазон. Перед 3D выбранный диапазон также пересчитывается.</w:t>
-      </w:r>
-    </w:p>
-    <w:p>
-      <w:pPr>
-        <w:spacing w:after="120"/>
-      </w:pPr>
-      <w:r>
-        <w:rPr>
-          <w:b/>
-          <w:bCs/>
-          <w:color w:val="2A7469"/>
-        </w:rPr>
-        <w:t xml:space="preserve">Вопрос: </w:t>
-      </w:r>
-      <w:r>
-        <w:rPr>
-          <w:b/>
-          <w:bCs/>
-        </w:rPr>
-        <w:t>Как работает ручная маска?</w:t>
-      </w:r>
-    </w:p>
-    <w:p>
-      <w:pPr>
-        <w:spacing w:after="170"/>
-      </w:pPr>
-      <w:r>
-        <w:rPr>
-          <w:b/>
-          <w:bCs/>
-        </w:rPr>
-        <w:t xml:space="preserve">Ответ: </w:t>
-      </w:r>
-      <w:r>
-        <w:t>Это отдельное черно-белое изображение. Белое оставляет пиксель, черное зануляет его после автоматических фильтров.</w:t>
-      </w:r>
-    </w:p>
-    <w:p>
-      <w:pPr>
-        <w:spacing w:after="120"/>
-      </w:pPr>
-      <w:r>
-        <w:rPr>
-          <w:b/>
-          <w:bCs/>
-          <w:color w:val="2A7469"/>
-        </w:rPr>
-        <w:t xml:space="preserve">Вопрос: </w:t>
-      </w:r>
-      <w:r>
-        <w:rPr>
-          <w:b/>
-          <w:bCs/>
-        </w:rPr>
-        <w:t>Маска меняет исходный DICOM?</w:t>
-      </w:r>
-    </w:p>
-    <w:p>
-      <w:pPr>
-        <w:spacing w:after="170"/>
-      </w:pPr>
-      <w:r>
-        <w:rPr>
-          <w:b/>
-          <w:bCs/>
-        </w:rPr>
-        <w:lastRenderedPageBreak/>
-        <w:t xml:space="preserve">Ответ: </w:t>
-      </w:r>
-      <w:r>
-        <w:t>Нет. OriginalImage и HU-массив остаются неизменными. Меняется только manualMask и processedImage.</w:t>
-      </w:r>
-    </w:p>
-    <w:p>
-      <w:pPr>
-        <w:spacing w:after="120"/>
-      </w:pPr>
-      <w:r>
-        <w:rPr>
-          <w:b/>
-          <w:bCs/>
-          <w:color w:val="2A7469"/>
-        </w:rPr>
-        <w:t xml:space="preserve">Вопрос: </w:t>
-      </w:r>
-      <w:r>
-        <w:rPr>
-          <w:b/>
-          <w:bCs/>
-        </w:rPr>
-        <w:t>Что такое шаг выборки?</w:t>
-      </w:r>
-    </w:p>
-    <w:p>
-      <w:pPr>
-        <w:spacing w:after="170"/>
-      </w:pPr>
-      <w:r>
-        <w:rPr>
-          <w:b/>
-          <w:bCs/>
-        </w:rPr>
-        <w:t xml:space="preserve">Ответ: </w:t>
-      </w:r>
-      <w:r>
-        <w:t>Через сколько пикселей брать данные по X/Y. Чем меньше шаг, тем больше деталей и нагрузка. По Z используется max(1, step/2).</w:t>
-      </w:r>
-    </w:p>
-    <w:p>
-      <w:pPr>
-        <w:spacing w:after="120"/>
-      </w:pPr>
-      <w:r>
-        <w:rPr>
-          <w:b/>
-          <w:bCs/>
-          <w:color w:val="2A7469"/>
-        </w:rPr>
-        <w:t xml:space="preserve">Вопрос: </w:t>
-      </w:r>
-      <w:r>
-        <w:rPr>
-          <w:b/>
-          <w:bCs/>
-        </w:rPr>
-        <w:t>Как строится трехмерка?</w:t>
-      </w:r>
-    </w:p>
-    <w:p>
-      <w:pPr>
-        <w:spacing w:after="170"/>
-      </w:pPr>
-      <w:r>
-        <w:rPr>
-          <w:b/>
-          <w:bCs/>
-        </w:rPr>
-        <w:t xml:space="preserve">Ответ: </w:t>
-      </w:r>
-      <w:r>
-        <w:t>Обработанные ненулевые пиксели превращаются в активные воксели, очищаются от шума, затем берутся поверхностные воксели и переводятся в физические координаты.</w:t>
-      </w:r>
-    </w:p>
-    <w:p>
-      <w:pPr>
-        <w:spacing w:after="120"/>
-      </w:pPr>
-      <w:r>
-        <w:rPr>
-          <w:b/>
-          <w:bCs/>
-          <w:color w:val="2A7469"/>
-        </w:rPr>
-        <w:t xml:space="preserve">Вопрос: </w:t>
-      </w:r>
-      <w:r>
-        <w:rPr>
-          <w:b/>
-          <w:bCs/>
-        </w:rPr>
-        <w:t>Это полноценная 3D-модель?</w:t>
-      </w:r>
-    </w:p>
-    <w:p>
-      <w:pPr>
-        <w:spacing w:after="170"/>
-      </w:pPr>
-      <w:r>
-        <w:rPr>
-          <w:b/>
-          <w:bCs/>
-        </w:rPr>
-        <w:t xml:space="preserve">Ответ: </w:t>
-      </w:r>
-      <w:r>
-        <w:t>Нет, это трехмерное облако поверхностных точек без треугольных граней.</w:t>
-      </w:r>
-    </w:p>
-    <w:p>
-      <w:pPr>
-        <w:spacing w:after="120"/>
-      </w:pPr>
-      <w:r>
-        <w:rPr>
-          <w:b/>
-          <w:bCs/>
-          <w:color w:val="2A7469"/>
-        </w:rPr>
-        <w:t xml:space="preserve">Вопрос: </w:t>
-      </w:r>
-      <w:r>
-        <w:rPr>
-          <w:b/>
-          <w:bCs/>
-        </w:rPr>
-        <w:t>Почему не берутся все активные воксели?</w:t>
-      </w:r>
-    </w:p>
-    <w:p>
-      <w:pPr>
-        <w:spacing w:after="170"/>
-      </w:pPr>
-      <w:r>
-        <w:rPr>
-          <w:b/>
-          <w:bCs/>
-        </w:rPr>
-        <w:t xml:space="preserve">Ответ: </w:t>
-      </w:r>
-      <w:r>
-        <w:t>Внутренние точки не видны и создают лишнюю нагрузку. Поэтому сохраняется только поверхность.</w:t>
-      </w:r>
-    </w:p>
-    <w:p>
-      <w:pPr>
-        <w:spacing w:after="120"/>
-      </w:pPr>
-      <w:r>
-        <w:rPr>
-          <w:b/>
-          <w:bCs/>
-          <w:color w:val="2A7469"/>
-        </w:rPr>
-        <w:t xml:space="preserve">Вопрос: </w:t>
-      </w:r>
-      <w:r>
-        <w:rPr>
-          <w:b/>
-          <w:bCs/>
-        </w:rPr>
-        <w:t>Как определяется поверхностный воксель?</w:t>
-      </w:r>
-    </w:p>
-    <w:p>
-      <w:pPr>
-        <w:spacing w:after="170"/>
-      </w:pPr>
-      <w:r>
-        <w:rPr>
-          <w:b/>
-          <w:bCs/>
-        </w:rPr>
-        <w:t xml:space="preserve">Ответ: </w:t>
-      </w:r>
-      <w:r>
-        <w:t>Если хотя бы один из шести соседей по X, Y или Z отсутствует, воксель считается поверхностным.</w:t>
-      </w:r>
-    </w:p>
-    <w:p>
-      <w:pPr>
-        <w:spacing w:after="120"/>
-      </w:pPr>
-      <w:r>
-        <w:rPr>
-          <w:b/>
-          <w:bCs/>
-          <w:color w:val="2A7469"/>
-        </w:rPr>
-        <w:t xml:space="preserve">Вопрос: </w:t>
-      </w:r>
-      <w:r>
-        <w:rPr>
-          <w:b/>
-          <w:bCs/>
-        </w:rPr>
-        <w:t>Как удаляется шум в 3D?</w:t>
-      </w:r>
-    </w:p>
-    <w:p>
-      <w:pPr>
-        <w:spacing w:after="170"/>
-      </w:pPr>
-      <w:r>
-        <w:rPr>
-          <w:b/>
-          <w:bCs/>
-        </w:rPr>
-        <w:t xml:space="preserve">Ответ: </w:t>
-      </w:r>
-      <w:r>
-        <w:t>Удаляются воксели менее чем с двумя соседями в 26-окрестности, затем связанные компоненты меньше 64 вокселей.</w:t>
-      </w:r>
-    </w:p>
-    <w:p>
-      <w:pPr>
-        <w:spacing w:after="120"/>
-      </w:pPr>
-      <w:r>
-        <w:rPr>
-          <w:b/>
-          <w:bCs/>
-          <w:color w:val="2A7469"/>
-        </w:rPr>
-        <w:t xml:space="preserve">Вопрос: </w:t>
-      </w:r>
-      <w:r>
-        <w:rPr>
-          <w:b/>
-          <w:bCs/>
-        </w:rPr>
-        <w:t>Почему не оставляется только крупнейшая 3D-компонента?</w:t>
-      </w:r>
-    </w:p>
-    <w:p>
-      <w:pPr>
-        <w:spacing w:after="170"/>
-      </w:pPr>
-      <w:r>
-        <w:rPr>
-          <w:b/>
-          <w:bCs/>
-        </w:rPr>
-        <w:t xml:space="preserve">Ответ: </w:t>
-      </w:r>
-      <w:r>
-        <w:t>Кости и другие нужные структуры могут быть отдельными. Поэтому сохраняются все компоненты достаточного размера.</w:t>
-      </w:r>
-    </w:p>
-    <w:p>
-      <w:pPr>
-        <w:spacing w:after="120"/>
-      </w:pPr>
-      <w:r>
-        <w:rPr>
-          <w:b/>
-          <w:bCs/>
-          <w:color w:val="2A7469"/>
-        </w:rPr>
-        <w:t xml:space="preserve">Вопрос: </w:t>
-      </w:r>
-      <w:r>
-        <w:rPr>
-          <w:b/>
-          <w:bCs/>
-        </w:rPr>
-        <w:t>Как убирается стол томографа?</w:t>
-      </w:r>
-    </w:p>
-    <w:p>
-      <w:pPr>
-        <w:spacing w:after="170"/>
-      </w:pPr>
-      <w:r>
-        <w:rPr>
-          <w:b/>
-          <w:bCs/>
-        </w:rPr>
-        <w:t xml:space="preserve">Ответ: </w:t>
-      </w:r>
-      <w:r>
-        <w:t>На каждом срезе строится маска пикселей выше −350 HU и оставляется крупнейшая связная область тела.</w:t>
-      </w:r>
-    </w:p>
-    <w:p>
-      <w:pPr>
-        <w:spacing w:after="120"/>
-      </w:pPr>
-      <w:r>
-        <w:rPr>
-          <w:b/>
-          <w:bCs/>
-          <w:color w:val="2A7469"/>
-        </w:rPr>
-        <w:t xml:space="preserve">Вопрос: </w:t>
-      </w:r>
-      <w:r>
-        <w:rPr>
-          <w:b/>
-          <w:bCs/>
-        </w:rPr>
-        <w:t>Почему пропорции 3D не искажены?</w:t>
-      </w:r>
-    </w:p>
-    <w:p>
-      <w:pPr>
-        <w:spacing w:after="170"/>
-      </w:pPr>
-      <w:r>
-        <w:rPr>
-          <w:b/>
-          <w:bCs/>
-        </w:rPr>
-        <w:t xml:space="preserve">Ответ: </w:t>
-      </w:r>
-      <w:r>
-        <w:t>Координаты рассчитываются с учетом PixelSpacing, положения среза по Z и SliceThickness как запасного варианта.</w:t>
-      </w:r>
-    </w:p>
-    <w:p>
-      <w:pPr>
-        <w:spacing w:after="120"/>
-      </w:pPr>
-      <w:r>
-        <w:rPr>
-          <w:b/>
-          <w:bCs/>
-          <w:color w:val="2A7469"/>
-        </w:rPr>
-        <w:t xml:space="preserve">Вопрос: </w:t>
-      </w:r>
-      <w:r>
-        <w:rPr>
-          <w:b/>
-          <w:bCs/>
-        </w:rPr>
-        <w:t>Зачем ограничение 260 тысяч точек?</w:t>
-      </w:r>
-    </w:p>
-    <w:p>
-      <w:pPr>
-        <w:spacing w:after="170"/>
-      </w:pPr>
-      <w:r>
-        <w:rPr>
-          <w:b/>
-          <w:bCs/>
-        </w:rPr>
-        <w:t xml:space="preserve">Ответ: </w:t>
-      </w:r>
-      <w:r>
-        <w:t>Чтобы отрисовка Java2D оставалась интерактивной. При превышении точки равномерно прореживаются.</w:t>
-      </w:r>
-    </w:p>
-    <w:p>
-      <w:pPr>
-        <w:spacing w:after="120"/>
-      </w:pPr>
-      <w:r>
-        <w:rPr>
-          <w:b/>
-          <w:bCs/>
-          <w:color w:val="2A7469"/>
-        </w:rPr>
-        <w:t xml:space="preserve">Вопрос: </w:t>
-      </w:r>
-      <w:r>
-        <w:rPr>
-          <w:b/>
-          <w:bCs/>
-        </w:rPr>
-        <w:t>Почему органы выглядят общей массой?</w:t>
-      </w:r>
-    </w:p>
-    <w:p>
-      <w:pPr>
-        <w:spacing w:after="170"/>
-      </w:pPr>
-      <w:r>
-        <w:rPr>
-          <w:b/>
-          <w:bCs/>
-        </w:rPr>
-        <w:t xml:space="preserve">Ответ: </w:t>
-      </w:r>
-      <w:r>
-        <w:t>Простой HU-диапазон выделяет ткани похожей плотности, но не знает анатомических границ конкретного органа. Для точной сегментации нужны более сложные методы.</w:t>
-      </w:r>
-    </w:p>
-    <w:p>
-      <w:pPr>
-        <w:spacing w:after="120"/>
-      </w:pPr>
-      <w:r>
-        <w:rPr>
-          <w:b/>
-          <w:bCs/>
-          <w:color w:val="2A7469"/>
-        </w:rPr>
-        <w:t xml:space="preserve">Вопрос: </w:t>
-      </w:r>
-      <w:r>
-        <w:rPr>
-          <w:b/>
-          <w:bCs/>
-        </w:rPr>
-        <w:t>Почему некоторые части кости могут пропасть?</w:t>
-      </w:r>
-    </w:p>
-    <w:p>
-      <w:pPr>
-        <w:spacing w:after="170"/>
-      </w:pPr>
-      <w:r>
-        <w:rPr>
-          <w:b/>
-          <w:bCs/>
-        </w:rPr>
-        <w:t xml:space="preserve">Ответ: </w:t>
-      </w:r>
-      <w:r>
-        <w:t>Они могут иметь HU ниже выбранного минимума, быть тоньше шага выборки или удалиться как слишком маленькая компонента. Нужно уменьшить minHU или шаг.</w:t>
-      </w:r>
-    </w:p>
-    <w:p>
-      <w:pPr>
-        <w:spacing w:after="120"/>
-      </w:pPr>
-      <w:r>
-        <w:rPr>
-          <w:b/>
-          <w:bCs/>
-          <w:color w:val="2A7469"/>
-        </w:rPr>
-        <w:t xml:space="preserve">Вопрос: </w:t>
-      </w:r>
-      <w:r>
-        <w:rPr>
-          <w:b/>
-          <w:bCs/>
-        </w:rPr>
-        <w:t>Почему программа использует SwingWorker?</w:t>
-      </w:r>
-    </w:p>
-    <w:p>
-      <w:pPr>
-        <w:spacing w:after="170"/>
-      </w:pPr>
-      <w:r>
-        <w:rPr>
-          <w:b/>
-          <w:bCs/>
-        </w:rPr>
-        <w:lastRenderedPageBreak/>
         <w:t xml:space="preserve">Ответ: </w:t>
       </w:r>
       <w:r>
@@ -8899,7 +8892,7 @@
         <w:spacing w:after="70" w:line="260" w:lineRule="auto"/>
       </w:pPr>
       <w:r>
-        <w:t>Проект не группирует файлы по Series Instance UID и не использует полную матрицу ориентации пациента. Он ориентирован на одну заранее выбранную серию.</w:t>
+        <w:t>Проект не группирует файлы по Series Instance UID. Он учитывает нормаль серии из ImageOrientationPatient для порядка и глубины, но не применяет полное преобразование локальных осей X/Y. Проект ориентирован на одну заранее выбранную серию.</w:t>
       </w:r>
     </w:p>
     <w:p>
@@ -8925,7 +8918,7 @@
         <w:spacing w:after="70" w:line="260" w:lineRule="auto"/>
       </w:pPr>
       <w:r>
-        <w:t>Медианный фильтр связан с ползунком размытия: при radius=0 отключены оба сглаживания.</w:t>
+        <w:t>Медианный фильтр включается отдельным флажком и имеет фиксированное ядро 3×3. Box blur управляется независимо ползунком радиуса 0…8.</w:t>
       </w:r>
     </w:p>
     <w:tbl>
@@ -9024,6 +9017,7 @@
         <w:pStyle w:val="2"/>
       </w:pPr>
       <w:r>
+        <w:lastRenderedPageBreak/>
         <w:t>Сборка JAR и запуск</w:t>
       </w:r>
     </w:p>
@@ -9256,7 +9250,6 @@
               <w:spacing w:line="245" w:lineRule="auto"/>
             </w:pPr>
             <w:r>
-              <w:lastRenderedPageBreak/>
               <w:t>Облако пустое</w:t>
             </w:r>
           </w:p>
@@ -9391,7 +9384,10 @@
               <w:spacing w:line="245" w:lineRule="auto"/>
             </w:pPr>
             <w:r>
-              <w:t>Увеличить minHU, сузить диапазон, использовать небольшой blur или ручную маску.</w:t>
+              <w:t>Проверить медианный фильтр, увеличить minHU, сузить диапазон, использовать небольшой blur или ручную маску.</w:t>
+            </w:r>
+            <w:r>
+              <w:t>.</w:t>
             </w:r>
           </w:p>
         </w:tc>
@@ -9499,7 +9495,10 @@
               <w:spacing w:line="245" w:lineRule="auto"/>
             </w:pPr>
             <w:r>
-              <w:t>Проверить ImagePositionPatient и InstanceNumber в исходной серии.</w:t>
+              <w:t>Проверить ImagePositionPatient, ImageOrientationPatient и InstanceNumber в исходной серии.</w:t>
+            </w:r>
+            <w:r>
+              <w:t>.</w:t>
             </w:r>
           </w:p>
         </w:tc>
@@ -9674,7 +9673,7 @@
         <w:spacing w:after="70" w:line="260" w:lineRule="auto"/>
       </w:pPr>
       <w:r>
-        <w:t>Срезы сортируются по Z, затем по Instance Number.</w:t>
+        <w:t>Срезы сортируются по положению вдоль нормали серии, затем по Instance Number.</w:t>
       </w:r>
     </w:p>
     <w:p>
@@ -9734,6 +9733,7 @@
         <w:pStyle w:val="2"/>
       </w:pPr>
       <w:r>
+        <w:lastRenderedPageBreak/>
         <w:t>Три лучших направления развития</w:t>
       </w:r>
     </w:p>

</xml_diff>

<commit_message>
Improve performance and remember recent folders
</commit_message>
<xml_diff>
--- a/docs/Шпаргалка для защиты DICOM-проекта.docx
+++ b/docs/Шпаргалка для защиты DICOM-проекта.docx
@@ -2831,7 +2831,7 @@
         <w:spacing w:after="90" w:line="270" w:lineRule="auto"/>
       </w:pPr>
       <w:r>
-        <w:t>MainFrame.importDicom() открывает JFileChooser: можно выбрать папку или отдельные файлы.</w:t>
+        <w:t>MainFrame.importDicom() открывает JFileChooser: можно выбрать папку или отдельные файлы. Последние пять папок сохраняются в меню «Файл → Недавние папки», одинаковые пути не дублируются.</w:t>
       </w:r>
     </w:p>
     <w:p>
@@ -2871,7 +2871,7 @@
         <w:spacing w:after="90" w:line="270" w:lineRule="auto"/>
       </w:pPr>
       <w:r>
-        <w:t>Для каждого файла считываются атрибуты и изображение, вычисляется HU-массив и создается DicomSlice.</w:t>
+        <w:t>Для каждого файла считываются атрибуты и изображение, вычисляется HU-массив и создается DicomSlice. Независимые файлы загружаются параллельно, поэтому порядок готовности не влияет на итоговую сортировку.</w:t>
       </w:r>
     </w:p>
     <w:p>
@@ -5645,11 +5645,7 @@
         </w:rPr>
       </w:pPr>
       <w:r>
-        <w:rPr>
-          <w:b/>
-          <w:color w:val="69742C"/>
-        </w:rPr>
-        <w:t>Если точек больше 260 000, список равномерно прореживается для приемлемой скорости отображения.</w:t>
+        <w:t>Если точек больше 500 000, список равномерно прореживается для приемлемой скорости отображения.</w:t>
       </w:r>
     </w:p>
     <w:p>
@@ -5673,14 +5669,7 @@
         <w:spacing w:before="80" w:after="120"/>
       </w:pPr>
       <w:r>
-        <w:rPr>
-          <w:b/>
-          <w:color w:val="2A7469"/>
-        </w:rPr>
-        <w:t xml:space="preserve">Подробнее: </w:t>
-      </w:r>
-      <w:r>
-        <w:t>децимация выбирает не случайные точки, а равномерные позиции из сформированного списка с вычисленным stride. Ограничение 260 000 относится только к отображаемому облаку и не изменяет исходные DICOM-данные. Компромисс — высокая интерактивность ценой части мелких визуальных деталей.</w:t>
+        <w:t>Подробнее: децимация выбирает не случайные точки, а равномерные позиции из сформированного списка с вычисленным stride. Ограничение 500 000 относится только к отображаемому облаку и не изменяет исходные DICOM-данные. Компромисс — высокая интерактивность ценой части мелких визуальных деталей.</w:t>
       </w:r>
     </w:p>
     <w:p>
@@ -5807,7 +5796,7 @@
         <w:spacing w:after="120"/>
       </w:pPr>
       <w:r>
-        <w:t>ModelViewerFrame получает готовый Model3D. Каждая ModelPoint хранит x, y, z, яркость и RGB. При каждом перерисовывании точки поворачиваются вокруг осей X и Y, переводятся в экранные координаты и сортируются по глубине. Дальние точки рисуются раньше, ближние — позже.</w:t>
+        <w:t>ModelViewerFrame получает готовый Model3D. Каждая ModelPoint хранит x, y, z, яркость и RGB. При каждом перерисовывании точки поворачиваются вокруг осей X и Y и переводятся в экранные координаты. Z-буфер хранит глубину ближайшей точки для каждого экранного пикселя, поэтому невидимые дальние точки не перекрывают ближние без дорогой сортировки всего облака.</w:t>
       </w:r>
     </w:p>
     <w:p>
@@ -7110,7 +7099,7 @@
         </w:numPr>
       </w:pPr>
       <w:r>
-        <w:t>Фильтры: открыть ImageProcessingService.java, сначала applyFilters(), затем конкретный метод median3x3(), boxBlur() или huBandPass().</w:t>
+        <w:t>Фильтры: открыть ImageProcessingService.java, сначала applyFilters(), затем конкретный метод median3x3(), boxBlur() или huBandPass(). При пакетной обработке независимые срезы фильтруются параллельно; уже примененная конфигурация не вычисляется повторно.</w:t>
       </w:r>
     </w:p>
     <w:p>
@@ -7158,7 +7147,7 @@
         </w:numPr>
       </w:pPr>
       <w:r>
-        <w:t>Отрисовка: открыть ModelViewerFrame.project(), где трехмерные координаты переводятся в экранные.</w:t>
+        <w:t>Отрисовка: открыть ModelViewerFrame.drawPoints(), где трехмерные координаты переводятся в экранные, а видимость определяется Z-буфером.</w:t>
       </w:r>
     </w:p>
     <w:p>
@@ -8625,19 +8614,7 @@
         <w:spacing w:after="120"/>
       </w:pPr>
       <w:r>
-        <w:rPr>
-          <w:b/>
-          <w:bCs/>
-          <w:color w:val="2A7469"/>
-        </w:rPr>
-        <w:t xml:space="preserve">Вопрос: </w:t>
-      </w:r>
-      <w:r>
-        <w:rPr>
-          <w:b/>
-          <w:bCs/>
-        </w:rPr>
-        <w:t>Зачем ограничение 260 тысяч точек?</w:t>
+        <w:t>Вопрос: Зачем ограничение 500 тысяч точек?</w:t>
       </w:r>
     </w:p>
     <w:p>
@@ -8645,14 +8622,7 @@
         <w:spacing w:after="170"/>
       </w:pPr>
       <w:r>
-        <w:rPr>
-          <w:b/>
-          <w:bCs/>
-        </w:rPr>
-        <w:t xml:space="preserve">Ответ: </w:t>
-      </w:r>
-      <w:r>
-        <w:t>Чтобы отрисовка Java2D оставалась интерактивной. При превышении точки равномерно прореживаются.</w:t>
+        <w:t>Ответ: Чтобы отрисовка оставалась интерактивной и память расходовалась предсказуемо. При превышении точки равномерно прореживаются, а само окно ускоряется Z-буфером.</w:t>
       </w:r>
     </w:p>
     <w:p>
@@ -9647,12 +9617,7 @@
         <w:ind w:left="240" w:right="240"/>
       </w:pPr>
       <w:r>
-        <w:rPr>
-          <w:rFonts w:ascii="Consolas" w:eastAsia="Consolas" w:hAnsi="Consolas" w:cs="Consolas"/>
-          <w:sz w:val="19"/>
-          <w:szCs w:val="19"/>
-        </w:rPr>
-        <w:t>Максимум отображаемых точек: 260 000; маска тела: HU &gt; −350</w:t>
+        <w:t>Максимум отображаемых точек: 500 000; маска тела: HU &gt; −350</w:t>
       </w:r>
     </w:p>
     <w:p>

</xml_diff>